<commit_message>
Updated for 2025 job search.
</commit_message>
<xml_diff>
--- a/resumes/Syd Polk with Baseball.docx
+++ b/resumes/Syd Polk with Baseball.docx
@@ -1,6 +1,6 @@
 
 <file path=word/document.xml><?xml version="1.0" encoding="utf-8"?>
-<w:document xmlns:wpc="http://schemas.microsoft.com/office/word/2010/wordprocessingCanvas" xmlns:cx="http://schemas.microsoft.com/office/drawing/2014/chartex" xmlns:cx1="http://schemas.microsoft.com/office/drawing/2015/9/8/chartex" xmlns:cx2="http://schemas.microsoft.com/office/drawing/2015/10/21/chartex" xmlns:cx3="http://schemas.microsoft.com/office/drawing/2016/5/9/chartex" xmlns:cx4="http://schemas.microsoft.com/office/drawing/2016/5/10/chartex" xmlns:cx5="http://schemas.microsoft.com/office/drawing/2016/5/11/chartex" xmlns:cx6="http://schemas.microsoft.com/office/drawing/2016/5/12/chartex" xmlns:cx7="http://schemas.microsoft.com/office/drawing/2016/5/13/chartex" xmlns:cx8="http://schemas.microsoft.com/office/drawing/2016/5/14/chartex" xmlns:mc="http://schemas.openxmlformats.org/markup-compatibility/2006" xmlns:aink="http://schemas.microsoft.com/office/drawing/2016/ink" xmlns:am3d="http://schemas.microsoft.com/office/drawing/2017/model3d" xmlns:o="urn:schemas-microsoft-com:office:office" xmlns:oel="http://schemas.microsoft.com/office/2019/extlst" xmlns:r="http://schemas.openxmlformats.org/officeDocument/2006/relationships" xmlns:m="http://schemas.openxmlformats.org/officeDocument/2006/math" xmlns:v="urn:schemas-microsoft-com:vml" xmlns:wp14="http://schemas.microsoft.com/office/word/2010/wordprocessingDrawing" xmlns:wp="http://schemas.openxmlformats.org/drawingml/2006/wordprocessingDrawing" xmlns:w10="urn:schemas-microsoft-com:office:word" xmlns:w="http://schemas.openxmlformats.org/wordprocessingml/2006/main" xmlns:w14="http://schemas.microsoft.com/office/word/2010/wordml" xmlns:w15="http://schemas.microsoft.com/office/word/2012/wordml" xmlns:w16cex="http://schemas.microsoft.com/office/word/2018/wordml/cex" xmlns:w16cid="http://schemas.microsoft.com/office/word/2016/wordml/cid" xmlns:w16="http://schemas.microsoft.com/office/word/2018/wordml" xmlns:w16sdtdh="http://schemas.microsoft.com/office/word/2020/wordml/sdtdatahash" xmlns:w16se="http://schemas.microsoft.com/office/word/2015/wordml/symex" xmlns:wpg="http://schemas.microsoft.com/office/word/2010/wordprocessingGroup" xmlns:wpi="http://schemas.microsoft.com/office/word/2010/wordprocessingInk" xmlns:wne="http://schemas.microsoft.com/office/word/2006/wordml" xmlns:wps="http://schemas.microsoft.com/office/word/2010/wordprocessingShape" mc:Ignorable="w14 w15 w16se w16cid w16 w16cex w16sdtdh wp14">
+<w:document xmlns:wpc="http://schemas.microsoft.com/office/word/2010/wordprocessingCanvas" xmlns:cx="http://schemas.microsoft.com/office/drawing/2014/chartex" xmlns:cx1="http://schemas.microsoft.com/office/drawing/2015/9/8/chartex" xmlns:cx2="http://schemas.microsoft.com/office/drawing/2015/10/21/chartex" xmlns:cx3="http://schemas.microsoft.com/office/drawing/2016/5/9/chartex" xmlns:cx4="http://schemas.microsoft.com/office/drawing/2016/5/10/chartex" xmlns:cx5="http://schemas.microsoft.com/office/drawing/2016/5/11/chartex" xmlns:cx6="http://schemas.microsoft.com/office/drawing/2016/5/12/chartex" xmlns:cx7="http://schemas.microsoft.com/office/drawing/2016/5/13/chartex" xmlns:cx8="http://schemas.microsoft.com/office/drawing/2016/5/14/chartex" xmlns:mc="http://schemas.openxmlformats.org/markup-compatibility/2006" xmlns:aink="http://schemas.microsoft.com/office/drawing/2016/ink" xmlns:am3d="http://schemas.microsoft.com/office/drawing/2017/model3d" xmlns:o="urn:schemas-microsoft-com:office:office" xmlns:oel="http://schemas.microsoft.com/office/2019/extlst" xmlns:r="http://schemas.openxmlformats.org/officeDocument/2006/relationships" xmlns:m="http://schemas.openxmlformats.org/officeDocument/2006/math" xmlns:v="urn:schemas-microsoft-com:vml" xmlns:wp14="http://schemas.microsoft.com/office/word/2010/wordprocessingDrawing" xmlns:wp="http://schemas.openxmlformats.org/drawingml/2006/wordprocessingDrawing" xmlns:w10="urn:schemas-microsoft-com:office:word" xmlns:w="http://schemas.openxmlformats.org/wordprocessingml/2006/main" xmlns:w14="http://schemas.microsoft.com/office/word/2010/wordml" xmlns:w15="http://schemas.microsoft.com/office/word/2012/wordml" xmlns:w16cex="http://schemas.microsoft.com/office/word/2018/wordml/cex" xmlns:w16cid="http://schemas.microsoft.com/office/word/2016/wordml/cid" xmlns:w16="http://schemas.microsoft.com/office/word/2018/wordml" xmlns:w16du="http://schemas.microsoft.com/office/word/2023/wordml/word16du" xmlns:w16sdtdh="http://schemas.microsoft.com/office/word/2020/wordml/sdtdatahash" xmlns:w16sdtfl="http://schemas.microsoft.com/office/word/2024/wordml/sdtformatlock" xmlns:w16se="http://schemas.microsoft.com/office/word/2015/wordml/symex" xmlns:wpg="http://schemas.microsoft.com/office/word/2010/wordprocessingGroup" xmlns:wpi="http://schemas.microsoft.com/office/word/2010/wordprocessingInk" xmlns:wne="http://schemas.microsoft.com/office/word/2006/wordml" xmlns:wps="http://schemas.microsoft.com/office/word/2010/wordprocessingShape" mc:Ignorable="w14 w15 w16se w16cid w16 w16cex w16sdtdh w16sdtfl w16du wp14">
   <w:body>
     <w:p>
       <w:pPr>
@@ -27,7 +27,7 @@
           <w:szCs w:val="32"/>
           <w:lang w:eastAsia="ar-SA"/>
         </w:rPr>
-        <w:t>Sydney Randall Polk</w:t>
+        <w:t>Syd</w:t>
       </w:r>
       <w:r>
         <w:rPr>
@@ -38,71 +38,7 @@
           <w:szCs w:val="32"/>
           <w:lang w:eastAsia="ar-SA"/>
         </w:rPr>
-        <w:t xml:space="preserve"> (Syd)</w:t>
-      </w:r>
-    </w:p>
-    <w:p>
-      <w:pPr>
-        <w:tabs>
-          <w:tab w:val="left" w:pos="-720"/>
-        </w:tabs>
-        <w:ind w:right="-720"/>
-        <w:jc w:val="center"/>
-        <w:rPr>
-          <w:rFonts w:ascii="Arial" w:hAnsi="Arial"/>
-          <w:color w:val="000000"/>
-          <w:sz w:val="16"/>
-          <w:szCs w:val="20"/>
-          <w:lang w:eastAsia="ar-SA"/>
-        </w:rPr>
-      </w:pPr>
-      <w:r>
-        <w:rPr>
-          <w:rFonts w:ascii="Arial" w:hAnsi="Arial"/>
-          <w:color w:val="000000"/>
-          <w:sz w:val="16"/>
-          <w:szCs w:val="20"/>
-          <w:lang w:eastAsia="ar-SA"/>
-        </w:rPr>
-        <w:t xml:space="preserve">12517 Capitol Saddlery </w:t>
-      </w:r>
-      <w:proofErr w:type="spellStart"/>
-      <w:r>
-        <w:rPr>
-          <w:rFonts w:ascii="Arial" w:hAnsi="Arial"/>
-          <w:color w:val="000000"/>
-          <w:sz w:val="16"/>
-          <w:szCs w:val="20"/>
-          <w:lang w:eastAsia="ar-SA"/>
-        </w:rPr>
-        <w:t>Trl</w:t>
-      </w:r>
-      <w:proofErr w:type="spellEnd"/>
-    </w:p>
-    <w:p>
-      <w:pPr>
-        <w:tabs>
-          <w:tab w:val="left" w:pos="-720"/>
-        </w:tabs>
-        <w:ind w:right="-720"/>
-        <w:jc w:val="center"/>
-        <w:rPr>
-          <w:rFonts w:ascii="Arial" w:hAnsi="Arial"/>
-          <w:color w:val="000000"/>
-          <w:sz w:val="16"/>
-          <w:szCs w:val="20"/>
-          <w:lang w:eastAsia="ar-SA"/>
-        </w:rPr>
-      </w:pPr>
-      <w:r>
-        <w:rPr>
-          <w:rFonts w:ascii="Arial" w:hAnsi="Arial"/>
-          <w:color w:val="000000"/>
-          <w:sz w:val="16"/>
-          <w:szCs w:val="20"/>
-          <w:lang w:eastAsia="ar-SA"/>
-        </w:rPr>
-        <w:t>Austin, TX 78732</w:t>
+        <w:t xml:space="preserve"> Polk</w:t>
       </w:r>
     </w:p>
     <w:p>
@@ -155,7 +91,7 @@
             <w:szCs w:val="20"/>
             <w:lang w:eastAsia="ar-SA"/>
           </w:rPr>
-          <w:t>sydpolk@gmail.com</w:t>
+          <w:t>syd@sydpolk.com</w:t>
         </w:r>
       </w:hyperlink>
     </w:p>
@@ -297,8 +233,20 @@
           <w:szCs w:val="22"/>
           <w:lang w:eastAsia="ar-SA"/>
         </w:rPr>
-        <w:t xml:space="preserve"> Amateur baseball analyst.</w:t>
-      </w:r>
+        <w:t xml:space="preserve"> </w:t>
+      </w:r>
+      <w:bookmarkStart w:id="0" w:name="_Hlk204378721"/>
+      <w:r>
+        <w:rPr>
+          <w:rFonts w:ascii="Arial" w:hAnsi="Arial"/>
+          <w:color w:val="000000"/>
+          <w:sz w:val="18"/>
+          <w:szCs w:val="22"/>
+          <w:lang w:eastAsia="ar-SA"/>
+        </w:rPr>
+        <w:t>Amateur baseball analyst.</w:t>
+      </w:r>
+      <w:bookmarkEnd w:id="0"/>
     </w:p>
     <w:p>
       <w:pPr>
@@ -414,6 +362,7 @@
           <w:lang w:eastAsia="ar-SA"/>
         </w:rPr>
       </w:pPr>
+      <w:bookmarkStart w:id="1" w:name="OLE_LINK10"/>
       <w:r>
         <w:rPr>
           <w:rFonts w:ascii="Arial" w:hAnsi="Arial"/>
@@ -525,6 +474,39 @@
         <w:t xml:space="preserve"> for Houston Astros, 1973 and 1974 seasons.</w:t>
       </w:r>
     </w:p>
+    <w:bookmarkEnd w:id="1"/>
+    <w:p>
+      <w:pPr>
+        <w:pStyle w:val="ListParagraph"/>
+        <w:numPr>
+          <w:ilvl w:val="0"/>
+          <w:numId w:val="1"/>
+        </w:numPr>
+        <w:tabs>
+          <w:tab w:val="clear" w:pos="1080"/>
+          <w:tab w:val="left" w:pos="-720"/>
+          <w:tab w:val="num" w:pos="360"/>
+        </w:tabs>
+        <w:ind w:left="360" w:right="-720"/>
+        <w:rPr>
+          <w:rFonts w:ascii="Arial" w:hAnsi="Arial"/>
+          <w:color w:val="000000"/>
+          <w:sz w:val="18"/>
+          <w:szCs w:val="18"/>
+          <w:lang w:eastAsia="ar-SA"/>
+        </w:rPr>
+      </w:pPr>
+      <w:r>
+        <w:rPr>
+          <w:rFonts w:ascii="Arial" w:hAnsi="Arial"/>
+          <w:color w:val="000000"/>
+          <w:sz w:val="18"/>
+          <w:szCs w:val="18"/>
+          <w:lang w:eastAsia="ar-SA"/>
+        </w:rPr>
+        <w:t>SABR member since 2022.</w:t>
+      </w:r>
+    </w:p>
     <w:p>
       <w:pPr>
         <w:tabs>
@@ -577,7 +559,7 @@
           <w:rFonts w:ascii="Arial" w:hAnsi="Arial"/>
           <w:b/>
           <w:color w:val="000000"/>
-          <w:sz w:val="18"/>
+          <w:sz w:val="20"/>
           <w:szCs w:val="22"/>
           <w:lang w:eastAsia="ar-SA"/>
         </w:rPr>
@@ -623,7 +605,7 @@
       <w:r>
         <w:rPr>
           <w:rFonts w:ascii="Arial" w:hAnsi="Arial"/>
-          <w:b/>
+          <w:bCs/>
           <w:color w:val="000000"/>
           <w:sz w:val="18"/>
           <w:szCs w:val="22"/>
@@ -631,6 +613,17 @@
         </w:rPr>
         <w:t>Austin, TX</w:t>
       </w:r>
+      <w:r>
+        <w:rPr>
+          <w:rFonts w:ascii="Arial" w:hAnsi="Arial"/>
+          <w:bCs/>
+          <w:color w:val="000000"/>
+          <w:sz w:val="18"/>
+          <w:szCs w:val="22"/>
+          <w:lang w:eastAsia="ar-SA"/>
+        </w:rPr>
+        <w:t>.</w:t>
+      </w:r>
     </w:p>
     <w:p>
       <w:pPr>
@@ -688,15 +681,26 @@
         </w:rPr>
         <w:t>-present</w:t>
       </w:r>
-    </w:p>
-    <w:p>
-      <w:pPr>
-        <w:tabs>
-          <w:tab w:val="left" w:pos="-720"/>
-        </w:tabs>
-        <w:ind w:right="-720"/>
-        <w:rPr>
-          <w:rFonts w:ascii="Arial" w:hAnsi="Arial"/>
+      <w:r>
+        <w:rPr>
+          <w:rFonts w:ascii="Arial" w:hAnsi="Arial"/>
+          <w:color w:val="000000"/>
+          <w:sz w:val="18"/>
+          <w:szCs w:val="22"/>
+          <w:lang w:eastAsia="ar-SA"/>
+        </w:rPr>
+        <w:t>.</w:t>
+      </w:r>
+    </w:p>
+    <w:p>
+      <w:pPr>
+        <w:tabs>
+          <w:tab w:val="left" w:pos="-720"/>
+        </w:tabs>
+        <w:ind w:right="-720"/>
+        <w:rPr>
+          <w:rFonts w:ascii="Arial" w:hAnsi="Arial"/>
+          <w:b/>
           <w:color w:val="000000"/>
           <w:sz w:val="18"/>
           <w:szCs w:val="22"/>
@@ -720,6 +724,8 @@
           <w:lang w:eastAsia="ar-SA"/>
         </w:rPr>
       </w:pPr>
+      <w:bookmarkStart w:id="2" w:name="OLE_LINK5"/>
+      <w:bookmarkStart w:id="3" w:name="OLE_LINK6"/>
       <w:r>
         <w:rPr>
           <w:rFonts w:ascii="Arial" w:hAnsi="Arial"/>
@@ -752,15 +758,61 @@
           <w:lang w:eastAsia="ar-SA"/>
         </w:rPr>
       </w:pPr>
-      <w:r>
-        <w:rPr>
-          <w:rFonts w:ascii="Arial" w:hAnsi="Arial"/>
-          <w:color w:val="000000"/>
-          <w:sz w:val="18"/>
-          <w:szCs w:val="22"/>
-          <w:lang w:eastAsia="ar-SA"/>
-        </w:rPr>
-        <w:t>Established an on-call system for mobile engineers based on a Datadog-based monitoring system for our mobile native applications.</w:t>
+      <w:bookmarkStart w:id="4" w:name="OLE_LINK3"/>
+      <w:bookmarkStart w:id="5" w:name="OLE_LINK4"/>
+      <w:r>
+        <w:rPr>
+          <w:rFonts w:ascii="Arial" w:hAnsi="Arial"/>
+          <w:color w:val="000000"/>
+          <w:sz w:val="18"/>
+          <w:szCs w:val="22"/>
+          <w:lang w:eastAsia="ar-SA"/>
+        </w:rPr>
+        <w:t xml:space="preserve">Developed user-facing native features using SwiftUI and </w:t>
+      </w:r>
+      <w:proofErr w:type="spellStart"/>
+      <w:r>
+        <w:rPr>
+          <w:rFonts w:ascii="Arial" w:hAnsi="Arial"/>
+          <w:color w:val="000000"/>
+          <w:sz w:val="18"/>
+          <w:szCs w:val="22"/>
+          <w:lang w:eastAsia="ar-SA"/>
+        </w:rPr>
+        <w:t>GraphQL</w:t>
+      </w:r>
+      <w:proofErr w:type="spellEnd"/>
+      <w:r>
+        <w:rPr>
+          <w:rFonts w:ascii="Arial" w:hAnsi="Arial"/>
+          <w:color w:val="000000"/>
+          <w:sz w:val="18"/>
+          <w:szCs w:val="22"/>
+          <w:lang w:eastAsia="ar-SA"/>
+        </w:rPr>
+        <w:t xml:space="preserve"> for </w:t>
+      </w:r>
+      <w:hyperlink r:id="rId6" w:history="1">
+        <w:r>
+          <w:rPr>
+            <w:rStyle w:val="Hyperlink"/>
+            <w:rFonts w:ascii="Arial" w:hAnsi="Arial"/>
+            <w:sz w:val="18"/>
+            <w:szCs w:val="22"/>
+            <w:lang w:eastAsia="ar-SA"/>
+          </w:rPr>
+          <w:t>Indeed’s Job Search app</w:t>
+        </w:r>
+      </w:hyperlink>
+      <w:r>
+        <w:rPr>
+          <w:rFonts w:ascii="Arial" w:hAnsi="Arial"/>
+          <w:color w:val="000000"/>
+          <w:sz w:val="18"/>
+          <w:szCs w:val="22"/>
+          <w:lang w:eastAsia="ar-SA"/>
+        </w:rPr>
+        <w:t>.</w:t>
       </w:r>
     </w:p>
     <w:p>
@@ -790,7 +842,7 @@
           <w:szCs w:val="22"/>
           <w:lang w:eastAsia="ar-SA"/>
         </w:rPr>
-        <w:t>~30 engineers in on-call rotation</w:t>
+        <w:t>The number of opt outs of all push notifications per day has dropped 30% since Native Push Notification Preferences was rolled out in January 2024.</w:t>
       </w:r>
     </w:p>
     <w:p>
@@ -820,7 +872,37 @@
           <w:szCs w:val="22"/>
           <w:lang w:eastAsia="ar-SA"/>
         </w:rPr>
-        <w:t>Developed Datadog logging and metrics in the iOS Job Search</w:t>
+        <w:t>Engagement between employers and job seekers using Indeed’s messaging has increased 9% since the native messaging was rolled out in late 2024.</w:t>
+      </w:r>
+    </w:p>
+    <w:p>
+      <w:pPr>
+        <w:pStyle w:val="ListParagraph"/>
+        <w:numPr>
+          <w:ilvl w:val="0"/>
+          <w:numId w:val="10"/>
+        </w:numPr>
+        <w:tabs>
+          <w:tab w:val="left" w:pos="-720"/>
+        </w:tabs>
+        <w:ind w:right="-720"/>
+        <w:rPr>
+          <w:rFonts w:ascii="Arial" w:hAnsi="Arial"/>
+          <w:color w:val="000000"/>
+          <w:sz w:val="18"/>
+          <w:szCs w:val="22"/>
+          <w:lang w:eastAsia="ar-SA"/>
+        </w:rPr>
+      </w:pPr>
+      <w:r>
+        <w:rPr>
+          <w:rFonts w:ascii="Arial" w:hAnsi="Arial"/>
+          <w:color w:val="000000"/>
+          <w:sz w:val="18"/>
+          <w:szCs w:val="22"/>
+          <w:lang w:eastAsia="ar-SA"/>
+        </w:rPr>
+        <w:t>Established an on-call system for mobile engineers based on a Datadog-based monitoring system for our mobile native applications.</w:t>
       </w:r>
     </w:p>
     <w:p>
@@ -850,7 +932,7 @@
           <w:szCs w:val="22"/>
           <w:lang w:eastAsia="ar-SA"/>
         </w:rPr>
-        <w:t>Developed runbooks and dashboards as resources during on-call events.</w:t>
+        <w:t>~30 engineers in on-call rotation</w:t>
       </w:r>
     </w:p>
     <w:p>
@@ -880,7 +962,7 @@
           <w:szCs w:val="22"/>
           <w:lang w:eastAsia="ar-SA"/>
         </w:rPr>
-        <w:t>Detected 3 events that were only evident in the iOS Job Search application.</w:t>
+        <w:t>Developed Datadog logging and metrics in the iOS Job Search app.</w:t>
       </w:r>
     </w:p>
     <w:p>
@@ -910,31 +992,41 @@
           <w:szCs w:val="22"/>
           <w:lang w:eastAsia="ar-SA"/>
         </w:rPr>
-        <w:t xml:space="preserve">Detected 4 events that were </w:t>
-      </w:r>
-      <w:proofErr w:type="gramStart"/>
-      <w:r>
-        <w:rPr>
-          <w:rFonts w:ascii="Arial" w:hAnsi="Arial"/>
-          <w:color w:val="000000"/>
-          <w:sz w:val="18"/>
-          <w:szCs w:val="22"/>
-          <w:lang w:eastAsia="ar-SA"/>
-        </w:rPr>
-        <w:t>Indeed-wide</w:t>
-      </w:r>
-      <w:proofErr w:type="gramEnd"/>
-      <w:r>
-        <w:rPr>
-          <w:rFonts w:ascii="Arial" w:hAnsi="Arial"/>
-          <w:color w:val="000000"/>
-          <w:sz w:val="18"/>
-          <w:szCs w:val="22"/>
-          <w:lang w:eastAsia="ar-SA"/>
-        </w:rPr>
-        <w:t xml:space="preserve"> before any server side alerts were sent.</w:t>
-      </w:r>
-    </w:p>
+        <w:t>Developed runbooks and dashboards as resources during on-call events.</w:t>
+      </w:r>
+    </w:p>
+    <w:p>
+      <w:pPr>
+        <w:pStyle w:val="ListParagraph"/>
+        <w:numPr>
+          <w:ilvl w:val="1"/>
+          <w:numId w:val="10"/>
+        </w:numPr>
+        <w:tabs>
+          <w:tab w:val="left" w:pos="-720"/>
+        </w:tabs>
+        <w:ind w:right="-720"/>
+        <w:rPr>
+          <w:rFonts w:ascii="Arial" w:hAnsi="Arial"/>
+          <w:color w:val="000000"/>
+          <w:sz w:val="18"/>
+          <w:szCs w:val="22"/>
+          <w:lang w:eastAsia="ar-SA"/>
+        </w:rPr>
+      </w:pPr>
+      <w:bookmarkStart w:id="6" w:name="_Hlk204378852"/>
+      <w:r>
+        <w:rPr>
+          <w:rFonts w:ascii="Arial" w:hAnsi="Arial"/>
+          <w:color w:val="000000"/>
+          <w:sz w:val="18"/>
+          <w:szCs w:val="22"/>
+          <w:lang w:eastAsia="ar-SA"/>
+        </w:rPr>
+        <w:t>The average time from when an outage started until the team was notified dropped from &gt;120 minutes to &lt; 5 minutes.</w:t>
+      </w:r>
+    </w:p>
+    <w:bookmarkEnd w:id="6"/>
     <w:p>
       <w:pPr>
         <w:pStyle w:val="ListParagraph"/>
@@ -962,61 +1054,41 @@
           <w:szCs w:val="22"/>
           <w:lang w:eastAsia="ar-SA"/>
         </w:rPr>
-        <w:t xml:space="preserve">Developed user-facing native features using </w:t>
-      </w:r>
-      <w:proofErr w:type="spellStart"/>
-      <w:r>
-        <w:rPr>
-          <w:rFonts w:ascii="Arial" w:hAnsi="Arial"/>
-          <w:color w:val="000000"/>
-          <w:sz w:val="18"/>
-          <w:szCs w:val="22"/>
-          <w:lang w:eastAsia="ar-SA"/>
-        </w:rPr>
-        <w:t>SwiftUI</w:t>
-      </w:r>
-      <w:proofErr w:type="spellEnd"/>
-      <w:r>
-        <w:rPr>
-          <w:rFonts w:ascii="Arial" w:hAnsi="Arial"/>
-          <w:color w:val="000000"/>
-          <w:sz w:val="18"/>
-          <w:szCs w:val="22"/>
-          <w:lang w:eastAsia="ar-SA"/>
-        </w:rPr>
-        <w:t xml:space="preserve"> and </w:t>
-      </w:r>
-      <w:proofErr w:type="spellStart"/>
-      <w:r>
-        <w:rPr>
-          <w:rFonts w:ascii="Arial" w:hAnsi="Arial"/>
-          <w:color w:val="000000"/>
-          <w:sz w:val="18"/>
-          <w:szCs w:val="22"/>
-          <w:lang w:eastAsia="ar-SA"/>
-        </w:rPr>
-        <w:t>GraphQL</w:t>
-      </w:r>
-      <w:proofErr w:type="spellEnd"/>
-      <w:r>
-        <w:rPr>
-          <w:rFonts w:ascii="Arial" w:hAnsi="Arial"/>
-          <w:color w:val="000000"/>
-          <w:sz w:val="18"/>
-          <w:szCs w:val="22"/>
-          <w:lang w:eastAsia="ar-SA"/>
-        </w:rPr>
-        <w:t>.</w:t>
-      </w:r>
-    </w:p>
-    <w:p>
-      <w:pPr>
-        <w:tabs>
-          <w:tab w:val="left" w:pos="-720"/>
-        </w:tabs>
-        <w:ind w:right="-720"/>
-        <w:rPr>
-          <w:rFonts w:ascii="Arial" w:hAnsi="Arial"/>
+        <w:t>Developed integration with Indeed’s A/B testing system</w:t>
+      </w:r>
+      <w:r>
+        <w:rPr>
+          <w:rFonts w:ascii="Arial" w:hAnsi="Arial"/>
+          <w:color w:val="000000"/>
+          <w:sz w:val="18"/>
+          <w:szCs w:val="22"/>
+          <w:lang w:eastAsia="ar-SA"/>
+        </w:rPr>
+        <w:t xml:space="preserve"> in the IOS Job Search app</w:t>
+      </w:r>
+      <w:r>
+        <w:rPr>
+          <w:rFonts w:ascii="Arial" w:hAnsi="Arial"/>
+          <w:color w:val="000000"/>
+          <w:sz w:val="18"/>
+          <w:szCs w:val="22"/>
+          <w:lang w:eastAsia="ar-SA"/>
+        </w:rPr>
+        <w:t>, enabling A/B tests of features and improvements.</w:t>
+      </w:r>
+    </w:p>
+    <w:bookmarkEnd w:id="4"/>
+    <w:bookmarkEnd w:id="5"/>
+    <w:p>
+      <w:pPr>
+        <w:tabs>
+          <w:tab w:val="left" w:pos="-720"/>
+        </w:tabs>
+        <w:ind w:right="-720"/>
+        <w:rPr>
+          <w:rFonts w:ascii="Arial" w:hAnsi="Arial"/>
+          <w:i/>
+          <w:iCs/>
           <w:color w:val="000000"/>
           <w:sz w:val="18"/>
           <w:szCs w:val="22"/>
@@ -1106,7 +1178,111 @@
           <w:szCs w:val="22"/>
           <w:lang w:eastAsia="ar-SA"/>
         </w:rPr>
-        <w:t>Measured a highly used service for latency and availability. Showed with instrumentation and Datadog metrics that the service was not ready to have a Service Level Obligation established.</w:t>
+        <w:t>Worked with one engineering team establishing SLO for its service</w:t>
+      </w:r>
+    </w:p>
+    <w:p>
+      <w:pPr>
+        <w:pStyle w:val="ListParagraph"/>
+        <w:numPr>
+          <w:ilvl w:val="1"/>
+          <w:numId w:val="10"/>
+        </w:numPr>
+        <w:tabs>
+          <w:tab w:val="left" w:pos="-720"/>
+        </w:tabs>
+        <w:ind w:right="-720"/>
+        <w:rPr>
+          <w:rFonts w:ascii="Arial" w:hAnsi="Arial"/>
+          <w:color w:val="000000"/>
+          <w:sz w:val="18"/>
+          <w:szCs w:val="22"/>
+          <w:lang w:eastAsia="ar-SA"/>
+        </w:rPr>
+      </w:pPr>
+      <w:r>
+        <w:rPr>
+          <w:rFonts w:ascii="Arial" w:hAnsi="Arial"/>
+          <w:color w:val="000000"/>
+          <w:sz w:val="18"/>
+          <w:szCs w:val="22"/>
+          <w:lang w:eastAsia="ar-SA"/>
+        </w:rPr>
+        <w:t>Did not implement any SLOs as the performance of the service was not fast or reliable enough.</w:t>
+      </w:r>
+    </w:p>
+    <w:p>
+      <w:pPr>
+        <w:pStyle w:val="ListParagraph"/>
+        <w:numPr>
+          <w:ilvl w:val="1"/>
+          <w:numId w:val="10"/>
+        </w:numPr>
+        <w:tabs>
+          <w:tab w:val="left" w:pos="-720"/>
+        </w:tabs>
+        <w:ind w:right="-720"/>
+        <w:rPr>
+          <w:rFonts w:ascii="Arial" w:hAnsi="Arial"/>
+          <w:color w:val="000000"/>
+          <w:sz w:val="18"/>
+          <w:szCs w:val="22"/>
+          <w:lang w:eastAsia="ar-SA"/>
+        </w:rPr>
+      </w:pPr>
+      <w:r>
+        <w:rPr>
+          <w:rFonts w:ascii="Arial" w:hAnsi="Arial"/>
+          <w:color w:val="000000"/>
+          <w:sz w:val="18"/>
+          <w:szCs w:val="22"/>
+          <w:lang w:eastAsia="ar-SA"/>
+        </w:rPr>
+        <w:t>Established level of metrics that would be acceptable.</w:t>
+      </w:r>
+    </w:p>
+    <w:p>
+      <w:pPr>
+        <w:tabs>
+          <w:tab w:val="left" w:pos="-720"/>
+        </w:tabs>
+        <w:ind w:right="-720"/>
+        <w:rPr>
+          <w:rFonts w:ascii="Arial" w:hAnsi="Arial"/>
+          <w:color w:val="000000"/>
+          <w:sz w:val="18"/>
+          <w:szCs w:val="22"/>
+          <w:lang w:eastAsia="ar-SA"/>
+        </w:rPr>
+      </w:pPr>
+    </w:p>
+    <w:p>
+      <w:pPr>
+        <w:tabs>
+          <w:tab w:val="left" w:pos="-720"/>
+        </w:tabs>
+        <w:ind w:right="-720"/>
+        <w:rPr>
+          <w:rFonts w:ascii="Arial" w:hAnsi="Arial"/>
+          <w:i/>
+          <w:iCs/>
+          <w:color w:val="000000"/>
+          <w:sz w:val="18"/>
+          <w:szCs w:val="22"/>
+          <w:lang w:eastAsia="ar-SA"/>
+        </w:rPr>
+      </w:pPr>
+      <w:r>
+        <w:rPr>
+          <w:rFonts w:ascii="Arial" w:hAnsi="Arial"/>
+          <w:i/>
+          <w:iCs/>
+          <w:color w:val="000000"/>
+          <w:sz w:val="18"/>
+          <w:szCs w:val="22"/>
+          <w:lang w:eastAsia="ar-SA"/>
+        </w:rPr>
+        <w:t>Software Engineer, Job Search Native API – November 2018-April 2022.</w:t>
       </w:r>
     </w:p>
     <w:p>
@@ -1136,51 +1312,237 @@
           <w:szCs w:val="22"/>
           <w:lang w:eastAsia="ar-SA"/>
         </w:rPr>
-        <w:t>Worked with other SREs to write a tutorial about Kubernetes for the SRE organization.</w:t>
-      </w:r>
-    </w:p>
-    <w:p>
-      <w:pPr>
-        <w:tabs>
-          <w:tab w:val="left" w:pos="-720"/>
-        </w:tabs>
-        <w:ind w:right="-720"/>
-        <w:rPr>
-          <w:rFonts w:ascii="Arial" w:hAnsi="Arial"/>
-          <w:color w:val="000000"/>
-          <w:sz w:val="18"/>
-          <w:szCs w:val="22"/>
-          <w:lang w:eastAsia="ar-SA"/>
-        </w:rPr>
-      </w:pPr>
-    </w:p>
-    <w:p>
-      <w:pPr>
-        <w:tabs>
-          <w:tab w:val="left" w:pos="-720"/>
-        </w:tabs>
-        <w:ind w:right="-720"/>
-        <w:rPr>
-          <w:rFonts w:ascii="Arial" w:hAnsi="Arial"/>
-          <w:i/>
-          <w:iCs/>
-          <w:color w:val="000000"/>
-          <w:sz w:val="18"/>
-          <w:szCs w:val="22"/>
-          <w:lang w:eastAsia="ar-SA"/>
-        </w:rPr>
-      </w:pPr>
-      <w:r>
-        <w:rPr>
-          <w:rFonts w:ascii="Arial" w:hAnsi="Arial"/>
-          <w:i/>
-          <w:iCs/>
-          <w:color w:val="000000"/>
-          <w:sz w:val="18"/>
-          <w:szCs w:val="22"/>
-          <w:lang w:eastAsia="ar-SA"/>
-        </w:rPr>
-        <w:t>Software Engineer, Job Search Native API – November 2018-April 2022.</w:t>
+        <w:t xml:space="preserve">Developed and evangelized </w:t>
+      </w:r>
+      <w:proofErr w:type="spellStart"/>
+      <w:r>
+        <w:rPr>
+          <w:rFonts w:ascii="Arial" w:hAnsi="Arial"/>
+          <w:color w:val="000000"/>
+          <w:sz w:val="18"/>
+          <w:szCs w:val="22"/>
+          <w:lang w:eastAsia="ar-SA"/>
+        </w:rPr>
+        <w:t>GraphQL</w:t>
+      </w:r>
+      <w:proofErr w:type="spellEnd"/>
+      <w:r>
+        <w:rPr>
+          <w:rFonts w:ascii="Arial" w:hAnsi="Arial"/>
+          <w:color w:val="000000"/>
+          <w:sz w:val="18"/>
+          <w:szCs w:val="22"/>
+          <w:lang w:eastAsia="ar-SA"/>
+        </w:rPr>
+        <w:t xml:space="preserve"> technology within Indeed. </w:t>
+      </w:r>
+    </w:p>
+    <w:p>
+      <w:pPr>
+        <w:pStyle w:val="ListParagraph"/>
+        <w:numPr>
+          <w:ilvl w:val="1"/>
+          <w:numId w:val="10"/>
+        </w:numPr>
+        <w:tabs>
+          <w:tab w:val="left" w:pos="-720"/>
+        </w:tabs>
+        <w:ind w:right="-720"/>
+        <w:rPr>
+          <w:rFonts w:ascii="Arial" w:hAnsi="Arial"/>
+          <w:color w:val="000000"/>
+          <w:sz w:val="18"/>
+          <w:szCs w:val="22"/>
+          <w:lang w:eastAsia="ar-SA"/>
+        </w:rPr>
+      </w:pPr>
+      <w:r>
+        <w:rPr>
+          <w:rFonts w:ascii="Arial" w:hAnsi="Arial"/>
+          <w:color w:val="000000"/>
+          <w:sz w:val="18"/>
+          <w:szCs w:val="22"/>
+          <w:lang w:eastAsia="ar-SA"/>
+        </w:rPr>
+        <w:t xml:space="preserve">Implemented </w:t>
+      </w:r>
+      <w:proofErr w:type="spellStart"/>
+      <w:r>
+        <w:rPr>
+          <w:rFonts w:ascii="Arial" w:hAnsi="Arial"/>
+          <w:color w:val="000000"/>
+          <w:sz w:val="18"/>
+          <w:szCs w:val="22"/>
+          <w:lang w:eastAsia="ar-SA"/>
+        </w:rPr>
+        <w:t>GraphQL</w:t>
+      </w:r>
+      <w:proofErr w:type="spellEnd"/>
+      <w:r>
+        <w:rPr>
+          <w:rFonts w:ascii="Arial" w:hAnsi="Arial"/>
+          <w:color w:val="000000"/>
+          <w:sz w:val="18"/>
+          <w:szCs w:val="22"/>
+          <w:lang w:eastAsia="ar-SA"/>
+        </w:rPr>
+        <w:t xml:space="preserve">-based microservices. </w:t>
+      </w:r>
+    </w:p>
+    <w:p>
+      <w:pPr>
+        <w:pStyle w:val="ListParagraph"/>
+        <w:numPr>
+          <w:ilvl w:val="1"/>
+          <w:numId w:val="10"/>
+        </w:numPr>
+        <w:tabs>
+          <w:tab w:val="left" w:pos="-720"/>
+        </w:tabs>
+        <w:ind w:right="-720"/>
+        <w:rPr>
+          <w:rFonts w:ascii="Arial" w:hAnsi="Arial"/>
+          <w:color w:val="000000"/>
+          <w:sz w:val="18"/>
+          <w:szCs w:val="22"/>
+          <w:lang w:eastAsia="ar-SA"/>
+        </w:rPr>
+      </w:pPr>
+      <w:r>
+        <w:rPr>
+          <w:rFonts w:ascii="Arial" w:hAnsi="Arial"/>
+          <w:color w:val="000000"/>
+          <w:sz w:val="18"/>
+          <w:szCs w:val="22"/>
+          <w:lang w:eastAsia="ar-SA"/>
+        </w:rPr>
+        <w:t xml:space="preserve">Converted existing microservices from REST to </w:t>
+      </w:r>
+      <w:proofErr w:type="spellStart"/>
+      <w:r>
+        <w:rPr>
+          <w:rFonts w:ascii="Arial" w:hAnsi="Arial"/>
+          <w:color w:val="000000"/>
+          <w:sz w:val="18"/>
+          <w:szCs w:val="22"/>
+          <w:lang w:eastAsia="ar-SA"/>
+        </w:rPr>
+        <w:t>GraphQL</w:t>
+      </w:r>
+      <w:proofErr w:type="spellEnd"/>
+      <w:r>
+        <w:rPr>
+          <w:rFonts w:ascii="Arial" w:hAnsi="Arial"/>
+          <w:color w:val="000000"/>
+          <w:sz w:val="18"/>
+          <w:szCs w:val="22"/>
+          <w:lang w:eastAsia="ar-SA"/>
+        </w:rPr>
+        <w:t xml:space="preserve">. </w:t>
+      </w:r>
+    </w:p>
+    <w:p>
+      <w:pPr>
+        <w:pStyle w:val="ListParagraph"/>
+        <w:numPr>
+          <w:ilvl w:val="1"/>
+          <w:numId w:val="10"/>
+        </w:numPr>
+        <w:tabs>
+          <w:tab w:val="left" w:pos="-720"/>
+        </w:tabs>
+        <w:ind w:right="-720"/>
+        <w:rPr>
+          <w:rFonts w:ascii="Arial" w:hAnsi="Arial"/>
+          <w:color w:val="000000"/>
+          <w:sz w:val="18"/>
+          <w:szCs w:val="22"/>
+          <w:lang w:eastAsia="ar-SA"/>
+        </w:rPr>
+      </w:pPr>
+      <w:r>
+        <w:rPr>
+          <w:rFonts w:ascii="Arial" w:hAnsi="Arial"/>
+          <w:color w:val="000000"/>
+          <w:sz w:val="18"/>
+          <w:szCs w:val="22"/>
+          <w:lang w:eastAsia="ar-SA"/>
+        </w:rPr>
+        <w:t xml:space="preserve">Developed demonstration </w:t>
+      </w:r>
+      <w:proofErr w:type="spellStart"/>
+      <w:r>
+        <w:rPr>
+          <w:rFonts w:ascii="Arial" w:hAnsi="Arial"/>
+          <w:color w:val="000000"/>
+          <w:sz w:val="18"/>
+          <w:szCs w:val="22"/>
+          <w:lang w:eastAsia="ar-SA"/>
+        </w:rPr>
+        <w:t>GraphQL</w:t>
+      </w:r>
+      <w:proofErr w:type="spellEnd"/>
+      <w:r>
+        <w:rPr>
+          <w:rFonts w:ascii="Arial" w:hAnsi="Arial"/>
+          <w:color w:val="000000"/>
+          <w:sz w:val="18"/>
+          <w:szCs w:val="22"/>
+          <w:lang w:eastAsia="ar-SA"/>
+        </w:rPr>
+        <w:t xml:space="preserve"> clients. </w:t>
+      </w:r>
+    </w:p>
+    <w:p>
+      <w:pPr>
+        <w:pStyle w:val="ListParagraph"/>
+        <w:numPr>
+          <w:ilvl w:val="1"/>
+          <w:numId w:val="10"/>
+        </w:numPr>
+        <w:tabs>
+          <w:tab w:val="left" w:pos="-720"/>
+        </w:tabs>
+        <w:ind w:right="-720"/>
+        <w:rPr>
+          <w:rFonts w:ascii="Arial" w:hAnsi="Arial"/>
+          <w:color w:val="000000"/>
+          <w:sz w:val="18"/>
+          <w:szCs w:val="22"/>
+          <w:lang w:eastAsia="ar-SA"/>
+        </w:rPr>
+      </w:pPr>
+      <w:r>
+        <w:rPr>
+          <w:rFonts w:ascii="Arial" w:hAnsi="Arial"/>
+          <w:color w:val="000000"/>
+          <w:sz w:val="18"/>
+          <w:szCs w:val="22"/>
+          <w:lang w:eastAsia="ar-SA"/>
+        </w:rPr>
+        <w:t xml:space="preserve">Advised and mentored other teams implementing </w:t>
+      </w:r>
+      <w:proofErr w:type="spellStart"/>
+      <w:r>
+        <w:rPr>
+          <w:rFonts w:ascii="Arial" w:hAnsi="Arial"/>
+          <w:color w:val="000000"/>
+          <w:sz w:val="18"/>
+          <w:szCs w:val="22"/>
+          <w:lang w:eastAsia="ar-SA"/>
+        </w:rPr>
+        <w:t>GraphQL</w:t>
+      </w:r>
+      <w:proofErr w:type="spellEnd"/>
+      <w:r>
+        <w:rPr>
+          <w:rFonts w:ascii="Arial" w:hAnsi="Arial"/>
+          <w:color w:val="000000"/>
+          <w:sz w:val="18"/>
+          <w:szCs w:val="22"/>
+          <w:lang w:eastAsia="ar-SA"/>
+        </w:rPr>
+        <w:t>.</w:t>
       </w:r>
     </w:p>
     <w:p>
@@ -1210,117 +1572,37 @@
           <w:szCs w:val="22"/>
           <w:lang w:eastAsia="ar-SA"/>
         </w:rPr>
-        <w:t xml:space="preserve">Developed and evangelized </w:t>
-      </w:r>
-      <w:proofErr w:type="spellStart"/>
-      <w:r>
-        <w:rPr>
-          <w:rFonts w:ascii="Arial" w:hAnsi="Arial"/>
-          <w:color w:val="000000"/>
-          <w:sz w:val="18"/>
-          <w:szCs w:val="22"/>
-          <w:lang w:eastAsia="ar-SA"/>
-        </w:rPr>
-        <w:t>GraphQL</w:t>
-      </w:r>
-      <w:proofErr w:type="spellEnd"/>
-      <w:r>
-        <w:rPr>
-          <w:rFonts w:ascii="Arial" w:hAnsi="Arial"/>
-          <w:color w:val="000000"/>
-          <w:sz w:val="18"/>
-          <w:szCs w:val="22"/>
-          <w:lang w:eastAsia="ar-SA"/>
-        </w:rPr>
-        <w:t xml:space="preserve"> technology within Indeed. Implemented </w:t>
-      </w:r>
-      <w:proofErr w:type="spellStart"/>
-      <w:r>
-        <w:rPr>
-          <w:rFonts w:ascii="Arial" w:hAnsi="Arial"/>
-          <w:color w:val="000000"/>
-          <w:sz w:val="18"/>
-          <w:szCs w:val="22"/>
-          <w:lang w:eastAsia="ar-SA"/>
-        </w:rPr>
-        <w:t>GraphQL</w:t>
-      </w:r>
-      <w:proofErr w:type="spellEnd"/>
-      <w:r>
-        <w:rPr>
-          <w:rFonts w:ascii="Arial" w:hAnsi="Arial"/>
-          <w:color w:val="000000"/>
-          <w:sz w:val="18"/>
-          <w:szCs w:val="22"/>
-          <w:lang w:eastAsia="ar-SA"/>
-        </w:rPr>
-        <w:t xml:space="preserve">-based microservices. Converted existing microservices from REST to </w:t>
-      </w:r>
-      <w:proofErr w:type="spellStart"/>
-      <w:r>
-        <w:rPr>
-          <w:rFonts w:ascii="Arial" w:hAnsi="Arial"/>
-          <w:color w:val="000000"/>
-          <w:sz w:val="18"/>
-          <w:szCs w:val="22"/>
-          <w:lang w:eastAsia="ar-SA"/>
-        </w:rPr>
-        <w:t>GraphQL</w:t>
-      </w:r>
-      <w:proofErr w:type="spellEnd"/>
-      <w:r>
-        <w:rPr>
-          <w:rFonts w:ascii="Arial" w:hAnsi="Arial"/>
-          <w:color w:val="000000"/>
-          <w:sz w:val="18"/>
-          <w:szCs w:val="22"/>
-          <w:lang w:eastAsia="ar-SA"/>
-        </w:rPr>
-        <w:t xml:space="preserve">. Developed demonstration </w:t>
-      </w:r>
-      <w:proofErr w:type="spellStart"/>
-      <w:r>
-        <w:rPr>
-          <w:rFonts w:ascii="Arial" w:hAnsi="Arial"/>
-          <w:color w:val="000000"/>
-          <w:sz w:val="18"/>
-          <w:szCs w:val="22"/>
-          <w:lang w:eastAsia="ar-SA"/>
-        </w:rPr>
-        <w:t>GraphQL</w:t>
-      </w:r>
-      <w:proofErr w:type="spellEnd"/>
-      <w:r>
-        <w:rPr>
-          <w:rFonts w:ascii="Arial" w:hAnsi="Arial"/>
-          <w:color w:val="000000"/>
-          <w:sz w:val="18"/>
-          <w:szCs w:val="22"/>
-          <w:lang w:eastAsia="ar-SA"/>
-        </w:rPr>
-        <w:t xml:space="preserve"> clients. Advised and mentored other teams implementing </w:t>
-      </w:r>
-      <w:proofErr w:type="spellStart"/>
-      <w:r>
-        <w:rPr>
-          <w:rFonts w:ascii="Arial" w:hAnsi="Arial"/>
-          <w:color w:val="000000"/>
-          <w:sz w:val="18"/>
-          <w:szCs w:val="22"/>
-          <w:lang w:eastAsia="ar-SA"/>
-        </w:rPr>
-        <w:t>GraphQL</w:t>
-      </w:r>
-      <w:proofErr w:type="spellEnd"/>
-      <w:r>
-        <w:rPr>
-          <w:rFonts w:ascii="Arial" w:hAnsi="Arial"/>
-          <w:color w:val="000000"/>
-          <w:sz w:val="18"/>
-          <w:szCs w:val="22"/>
-          <w:lang w:eastAsia="ar-SA"/>
-        </w:rPr>
-        <w:t>.</w:t>
+        <w:t xml:space="preserve">Split a small but important service from our main job search webserver for use as a microservice. </w:t>
+      </w:r>
+    </w:p>
+    <w:p>
+      <w:pPr>
+        <w:pStyle w:val="ListParagraph"/>
+        <w:numPr>
+          <w:ilvl w:val="1"/>
+          <w:numId w:val="10"/>
+        </w:numPr>
+        <w:tabs>
+          <w:tab w:val="left" w:pos="-720"/>
+        </w:tabs>
+        <w:ind w:right="-720"/>
+        <w:rPr>
+          <w:rFonts w:ascii="Arial" w:hAnsi="Arial"/>
+          <w:color w:val="000000"/>
+          <w:sz w:val="18"/>
+          <w:szCs w:val="22"/>
+          <w:lang w:eastAsia="ar-SA"/>
+        </w:rPr>
+      </w:pPr>
+      <w:r>
+        <w:rPr>
+          <w:rFonts w:ascii="Arial" w:hAnsi="Arial"/>
+          <w:color w:val="000000"/>
+          <w:sz w:val="18"/>
+          <w:szCs w:val="22"/>
+          <w:lang w:eastAsia="ar-SA"/>
+        </w:rPr>
+        <w:t>Service handles several million requests a week that would have otherwise been handled by the main Indeed server, decreasing request latency and memory pressure. Handles 100M+ requests/month with an internal latency average &lt; 100ms, and availability 99.0%</w:t>
       </w:r>
     </w:p>
     <w:p>
@@ -1350,7 +1632,37 @@
           <w:szCs w:val="22"/>
           <w:lang w:eastAsia="ar-SA"/>
         </w:rPr>
-        <w:t xml:space="preserve">Split a small but important service from our main job search webserver for use as a microservice. Designed, wrote, and deployed to QA. Service handles several million requests a week that would have otherwise been handled by the </w:t>
+        <w:t>Developed high-volume client logging library using Kafka</w:t>
+      </w:r>
+      <w:r>
+        <w:rPr>
+          <w:rFonts w:ascii="Arial" w:hAnsi="Arial"/>
+          <w:color w:val="000000"/>
+          <w:sz w:val="18"/>
+          <w:szCs w:val="22"/>
+          <w:lang w:eastAsia="ar-SA"/>
+        </w:rPr>
+        <w:t xml:space="preserve"> and Avro</w:t>
+      </w:r>
+      <w:r>
+        <w:rPr>
+          <w:rFonts w:ascii="Arial" w:hAnsi="Arial"/>
+          <w:color w:val="000000"/>
+          <w:sz w:val="18"/>
+          <w:szCs w:val="22"/>
+          <w:lang w:eastAsia="ar-SA"/>
+        </w:rPr>
+        <w:t xml:space="preserve"> that can handle tens of millions of logs per day from </w:t>
+      </w:r>
+      <w:r>
+        <w:rPr>
+          <w:rFonts w:ascii="Arial" w:hAnsi="Arial"/>
+          <w:color w:val="000000"/>
+          <w:sz w:val="18"/>
+          <w:szCs w:val="22"/>
+          <w:lang w:eastAsia="ar-SA"/>
+        </w:rPr>
+        <w:t xml:space="preserve">the </w:t>
       </w:r>
       <w:proofErr w:type="spellStart"/>
       <w:r>
@@ -1361,7 +1673,7 @@
           <w:szCs w:val="22"/>
           <w:lang w:eastAsia="ar-SA"/>
         </w:rPr>
-        <w:t>jobsearch</w:t>
+        <w:t>GlassDoor</w:t>
       </w:r>
       <w:proofErr w:type="spellEnd"/>
       <w:r>
@@ -1372,7 +1684,71 @@
           <w:szCs w:val="22"/>
           <w:lang w:eastAsia="ar-SA"/>
         </w:rPr>
-        <w:t xml:space="preserve"> server, decreasing request latency and memory pressure. Handles 100M+ requests/month with an internal latency average &lt; 100ms, and availability 99.0%</w:t>
+        <w:t xml:space="preserve"> native application</w:t>
+      </w:r>
+      <w:r>
+        <w:rPr>
+          <w:rFonts w:ascii="Arial" w:hAnsi="Arial"/>
+          <w:color w:val="000000"/>
+          <w:sz w:val="18"/>
+          <w:szCs w:val="22"/>
+          <w:lang w:eastAsia="ar-SA"/>
+        </w:rPr>
+        <w:t>.</w:t>
+      </w:r>
+    </w:p>
+    <w:p>
+      <w:pPr>
+        <w:tabs>
+          <w:tab w:val="left" w:pos="-720"/>
+        </w:tabs>
+        <w:ind w:right="-720"/>
+        <w:rPr>
+          <w:rFonts w:ascii="Arial" w:hAnsi="Arial"/>
+          <w:color w:val="000000"/>
+          <w:sz w:val="18"/>
+          <w:szCs w:val="22"/>
+          <w:lang w:eastAsia="ar-SA"/>
+        </w:rPr>
+      </w:pPr>
+    </w:p>
+    <w:p>
+      <w:pPr>
+        <w:tabs>
+          <w:tab w:val="left" w:pos="-720"/>
+        </w:tabs>
+        <w:ind w:right="-720"/>
+        <w:rPr>
+          <w:rFonts w:ascii="Arial" w:hAnsi="Arial"/>
+          <w:i/>
+          <w:iCs/>
+          <w:color w:val="000000"/>
+          <w:sz w:val="18"/>
+          <w:szCs w:val="22"/>
+          <w:lang w:eastAsia="ar-SA"/>
+        </w:rPr>
+      </w:pPr>
+      <w:r>
+        <w:rPr>
+          <w:rFonts w:ascii="Arial" w:hAnsi="Arial"/>
+          <w:i/>
+          <w:iCs/>
+          <w:color w:val="000000"/>
+          <w:sz w:val="18"/>
+          <w:szCs w:val="22"/>
+          <w:lang w:eastAsia="ar-SA"/>
+        </w:rPr>
+        <w:t>Software Engineer, Job Search Front End – April 2016-November 2018.</w:t>
+      </w:r>
+      <w:r>
+        <w:rPr>
+          <w:rFonts w:ascii="Arial" w:hAnsi="Arial"/>
+          <w:color w:val="000000"/>
+          <w:sz w:val="18"/>
+          <w:szCs w:val="22"/>
+          <w:lang w:eastAsia="ar-SA"/>
+        </w:rPr>
+        <w:t xml:space="preserve"> </w:t>
       </w:r>
     </w:p>
     <w:p>
@@ -1402,73 +1778,7 @@
           <w:szCs w:val="22"/>
           <w:lang w:eastAsia="ar-SA"/>
         </w:rPr>
-        <w:t xml:space="preserve">Developed high-volume client logging library using Kafka that can handle tens of millions of logs per day from native applications such as </w:t>
-      </w:r>
-      <w:proofErr w:type="spellStart"/>
-      <w:r>
-        <w:rPr>
-          <w:rFonts w:ascii="Arial" w:hAnsi="Arial"/>
-          <w:color w:val="000000"/>
-          <w:sz w:val="18"/>
-          <w:szCs w:val="22"/>
-          <w:lang w:eastAsia="ar-SA"/>
-        </w:rPr>
-        <w:t>GlassDoor</w:t>
-      </w:r>
-      <w:proofErr w:type="spellEnd"/>
-      <w:r>
-        <w:rPr>
-          <w:rFonts w:ascii="Arial" w:hAnsi="Arial"/>
-          <w:color w:val="000000"/>
-          <w:sz w:val="18"/>
-          <w:szCs w:val="22"/>
-          <w:lang w:eastAsia="ar-SA"/>
-        </w:rPr>
-        <w:t xml:space="preserve"> and Indeed Job Search.</w:t>
-      </w:r>
-    </w:p>
-    <w:p>
-      <w:pPr>
-        <w:tabs>
-          <w:tab w:val="left" w:pos="-720"/>
-        </w:tabs>
-        <w:ind w:right="-720"/>
-        <w:rPr>
-          <w:rFonts w:ascii="Arial" w:hAnsi="Arial"/>
-          <w:color w:val="000000"/>
-          <w:sz w:val="18"/>
-          <w:szCs w:val="22"/>
-          <w:lang w:eastAsia="ar-SA"/>
-        </w:rPr>
-      </w:pPr>
-    </w:p>
-    <w:p>
-      <w:pPr>
-        <w:tabs>
-          <w:tab w:val="left" w:pos="-720"/>
-        </w:tabs>
-        <w:ind w:right="-720"/>
-        <w:rPr>
-          <w:rFonts w:ascii="Arial" w:hAnsi="Arial"/>
-          <w:i/>
-          <w:iCs/>
-          <w:color w:val="000000"/>
-          <w:sz w:val="18"/>
-          <w:szCs w:val="22"/>
-          <w:lang w:eastAsia="ar-SA"/>
-        </w:rPr>
-      </w:pPr>
-      <w:r>
-        <w:rPr>
-          <w:rFonts w:ascii="Arial" w:hAnsi="Arial"/>
-          <w:i/>
-          <w:iCs/>
-          <w:color w:val="000000"/>
-          <w:sz w:val="18"/>
-          <w:szCs w:val="22"/>
-          <w:lang w:eastAsia="ar-SA"/>
-        </w:rPr>
-        <w:t>Software Engineer, Job Search Front End – April 2016-November 2018.</w:t>
+        <w:t>A/B testing of various features on the job viewing web page; increased user engagement 5-8%.</w:t>
       </w:r>
     </w:p>
     <w:p>
@@ -1498,7 +1808,7 @@
           <w:szCs w:val="22"/>
           <w:lang w:eastAsia="ar-SA"/>
         </w:rPr>
-        <w:t xml:space="preserve">Designed and developed features for the IOS Job Search app from Indeed. Reduced crash rate by 5x. </w:t>
+        <w:t>Made build system improvements that resulting in our builds being 25-30% faster.</w:t>
       </w:r>
     </w:p>
     <w:p>
@@ -1528,153 +1838,113 @@
           <w:szCs w:val="22"/>
           <w:lang w:eastAsia="ar-SA"/>
         </w:rPr>
-        <w:t>A/B testing of various features on the job viewing web page; increased user engagement 5-8%.</w:t>
-      </w:r>
-    </w:p>
-    <w:p>
-      <w:pPr>
-        <w:pStyle w:val="ListParagraph"/>
-        <w:numPr>
-          <w:ilvl w:val="0"/>
-          <w:numId w:val="10"/>
-        </w:numPr>
-        <w:tabs>
-          <w:tab w:val="left" w:pos="-720"/>
-        </w:tabs>
-        <w:ind w:right="-720"/>
-        <w:rPr>
-          <w:rFonts w:ascii="Arial" w:hAnsi="Arial"/>
-          <w:color w:val="000000"/>
-          <w:sz w:val="18"/>
-          <w:szCs w:val="22"/>
-          <w:lang w:eastAsia="ar-SA"/>
-        </w:rPr>
-      </w:pPr>
-      <w:r>
-        <w:rPr>
-          <w:rFonts w:ascii="Arial" w:hAnsi="Arial"/>
-          <w:color w:val="000000"/>
-          <w:sz w:val="18"/>
-          <w:szCs w:val="22"/>
-          <w:lang w:eastAsia="ar-SA"/>
-        </w:rPr>
-        <w:t>Made build system improvements that resulting in our builds being 25-30% faster.</w:t>
-      </w:r>
-    </w:p>
-    <w:p>
-      <w:pPr>
-        <w:pStyle w:val="ListParagraph"/>
-        <w:numPr>
-          <w:ilvl w:val="0"/>
-          <w:numId w:val="10"/>
-        </w:numPr>
-        <w:tabs>
-          <w:tab w:val="left" w:pos="-720"/>
-        </w:tabs>
-        <w:ind w:right="-720"/>
-        <w:rPr>
-          <w:rFonts w:ascii="Arial" w:hAnsi="Arial"/>
-          <w:color w:val="000000"/>
-          <w:sz w:val="18"/>
-          <w:szCs w:val="22"/>
-          <w:lang w:eastAsia="ar-SA"/>
-        </w:rPr>
-      </w:pPr>
-      <w:r>
-        <w:rPr>
-          <w:rFonts w:ascii="Arial" w:hAnsi="Arial"/>
-          <w:color w:val="000000"/>
-          <w:sz w:val="18"/>
-          <w:szCs w:val="22"/>
-          <w:lang w:eastAsia="ar-SA"/>
-        </w:rPr>
         <w:t>Participated in hundreds of onsite interviews for potential candidates to work at Indeed.</w:t>
       </w:r>
     </w:p>
-    <w:p>
-      <w:pPr>
-        <w:tabs>
-          <w:tab w:val="left" w:pos="-720"/>
-        </w:tabs>
-        <w:ind w:right="-720"/>
-        <w:rPr>
-          <w:rFonts w:ascii="Arial" w:hAnsi="Arial"/>
-          <w:b/>
-          <w:color w:val="000000"/>
-          <w:sz w:val="18"/>
-          <w:szCs w:val="22"/>
-          <w:lang w:eastAsia="ar-SA"/>
-        </w:rPr>
-      </w:pPr>
-    </w:p>
-    <w:p>
-      <w:pPr>
-        <w:tabs>
-          <w:tab w:val="left" w:pos="-720"/>
-        </w:tabs>
-        <w:ind w:right="-720"/>
-        <w:rPr>
-          <w:rFonts w:ascii="Arial" w:hAnsi="Arial"/>
-          <w:b/>
-          <w:color w:val="000000"/>
-          <w:sz w:val="18"/>
-          <w:szCs w:val="22"/>
-          <w:lang w:eastAsia="ar-SA"/>
-        </w:rPr>
-      </w:pPr>
-    </w:p>
-    <w:p>
-      <w:pPr>
-        <w:tabs>
-          <w:tab w:val="left" w:pos="-720"/>
-        </w:tabs>
-        <w:ind w:right="-720"/>
-        <w:rPr>
-          <w:rFonts w:ascii="Arial" w:hAnsi="Arial"/>
-          <w:b/>
-          <w:color w:val="000000"/>
-          <w:sz w:val="18"/>
-          <w:szCs w:val="22"/>
-          <w:lang w:eastAsia="ar-SA"/>
-        </w:rPr>
-      </w:pPr>
-      <w:r>
-        <w:rPr>
-          <w:rFonts w:ascii="Arial" w:hAnsi="Arial"/>
-          <w:b/>
-          <w:color w:val="000000"/>
-          <w:sz w:val="18"/>
-          <w:szCs w:val="22"/>
-          <w:lang w:eastAsia="ar-SA"/>
-        </w:rPr>
-        <w:lastRenderedPageBreak/>
-        <w:t>Mozilla, Inc., Mountain View, CA</w:t>
-      </w:r>
-    </w:p>
-    <w:p>
-      <w:pPr>
-        <w:tabs>
-          <w:tab w:val="left" w:pos="-720"/>
-        </w:tabs>
-        <w:ind w:right="-720"/>
-        <w:rPr>
-          <w:rFonts w:ascii="Arial" w:hAnsi="Arial"/>
-          <w:color w:val="000000"/>
-          <w:sz w:val="18"/>
-          <w:szCs w:val="22"/>
-          <w:lang w:eastAsia="ar-SA"/>
-        </w:rPr>
-      </w:pPr>
-      <w:r>
-        <w:rPr>
-          <w:rFonts w:ascii="Arial" w:hAnsi="Arial"/>
-          <w:b/>
-          <w:color w:val="000000"/>
-          <w:sz w:val="18"/>
-          <w:szCs w:val="22"/>
-          <w:lang w:eastAsia="ar-SA"/>
-        </w:rPr>
-        <w:t xml:space="preserve">Technical Lead, Platform QA, </w:t>
+    <w:bookmarkEnd w:id="2"/>
+    <w:bookmarkEnd w:id="3"/>
+    <w:p>
+      <w:pPr>
+        <w:tabs>
+          <w:tab w:val="left" w:pos="-720"/>
+        </w:tabs>
+        <w:ind w:right="-720"/>
+        <w:rPr>
+          <w:rFonts w:ascii="Arial" w:hAnsi="Arial"/>
+          <w:b/>
+          <w:color w:val="000000"/>
+          <w:sz w:val="18"/>
+          <w:szCs w:val="22"/>
+          <w:lang w:eastAsia="ar-SA"/>
+        </w:rPr>
+      </w:pPr>
+    </w:p>
+    <w:p>
+      <w:pPr>
+        <w:widowControl/>
+        <w:suppressAutoHyphens w:val="0"/>
+        <w:rPr>
+          <w:rFonts w:ascii="Arial" w:hAnsi="Arial"/>
+          <w:b/>
+          <w:color w:val="000000"/>
+          <w:sz w:val="18"/>
+          <w:szCs w:val="22"/>
+          <w:lang w:eastAsia="ar-SA"/>
+        </w:rPr>
+      </w:pPr>
+      <w:r>
+        <w:rPr>
+          <w:rFonts w:ascii="Arial" w:hAnsi="Arial"/>
+          <w:b/>
+          <w:color w:val="000000"/>
+          <w:sz w:val="18"/>
+          <w:szCs w:val="22"/>
+          <w:lang w:eastAsia="ar-SA"/>
+        </w:rPr>
+        <w:t xml:space="preserve">Mozilla, Inc., </w:t>
+      </w:r>
+      <w:r>
+        <w:rPr>
+          <w:rFonts w:ascii="Arial" w:hAnsi="Arial"/>
+          <w:bCs/>
+          <w:color w:val="000000"/>
+          <w:sz w:val="18"/>
+          <w:szCs w:val="22"/>
+          <w:lang w:eastAsia="ar-SA"/>
+        </w:rPr>
+        <w:t>Mountain View, CA</w:t>
+      </w:r>
+      <w:r>
+        <w:rPr>
+          <w:rFonts w:ascii="Arial" w:hAnsi="Arial"/>
+          <w:bCs/>
+          <w:color w:val="000000"/>
+          <w:sz w:val="18"/>
+          <w:szCs w:val="22"/>
+          <w:lang w:eastAsia="ar-SA"/>
+        </w:rPr>
+        <w:t xml:space="preserve"> (remote).</w:t>
+      </w:r>
+    </w:p>
+    <w:p>
+      <w:pPr>
+        <w:tabs>
+          <w:tab w:val="left" w:pos="-720"/>
+        </w:tabs>
+        <w:ind w:right="-720"/>
+        <w:rPr>
+          <w:rFonts w:ascii="Arial" w:hAnsi="Arial"/>
+          <w:color w:val="000000"/>
+          <w:sz w:val="18"/>
+          <w:szCs w:val="22"/>
+          <w:lang w:eastAsia="ar-SA"/>
+        </w:rPr>
+      </w:pPr>
+      <w:bookmarkStart w:id="7" w:name="OLE_LINK7"/>
+      <w:bookmarkStart w:id="8" w:name="OLE_LINK8"/>
+      <w:r>
+        <w:rPr>
+          <w:rFonts w:ascii="Arial" w:hAnsi="Arial"/>
+          <w:b/>
+          <w:color w:val="000000"/>
+          <w:sz w:val="18"/>
+          <w:szCs w:val="22"/>
+          <w:lang w:eastAsia="ar-SA"/>
+        </w:rPr>
+        <w:t>Technical Lead, Platform QA</w:t>
+      </w:r>
+      <w:bookmarkEnd w:id="7"/>
+      <w:bookmarkEnd w:id="8"/>
+      <w:r>
+        <w:rPr>
+          <w:rFonts w:ascii="Arial" w:hAnsi="Arial"/>
+          <w:b/>
+          <w:color w:val="000000"/>
+          <w:sz w:val="18"/>
+          <w:szCs w:val="22"/>
+          <w:lang w:eastAsia="ar-SA"/>
+        </w:rPr>
+        <w:t xml:space="preserve">, </w:t>
       </w:r>
       <w:r>
         <w:rPr>
@@ -1694,50 +1964,70 @@
           <w:szCs w:val="22"/>
           <w:lang w:eastAsia="ar-SA"/>
         </w:rPr>
-        <w:t>April 2016</w:t>
-      </w:r>
-    </w:p>
-    <w:p>
-      <w:pPr>
-        <w:tabs>
-          <w:tab w:val="left" w:pos="-720"/>
-        </w:tabs>
-        <w:ind w:right="-720"/>
-        <w:rPr>
-          <w:rFonts w:ascii="Arial" w:hAnsi="Arial"/>
-          <w:b/>
-          <w:color w:val="000000"/>
-          <w:sz w:val="18"/>
-          <w:szCs w:val="22"/>
-          <w:lang w:eastAsia="ar-SA"/>
-        </w:rPr>
-      </w:pPr>
-    </w:p>
-    <w:p>
-      <w:pPr>
-        <w:tabs>
-          <w:tab w:val="left" w:pos="-720"/>
-        </w:tabs>
-        <w:ind w:right="-720"/>
-        <w:rPr>
-          <w:rFonts w:ascii="Arial" w:hAnsi="Arial"/>
-          <w:b/>
-          <w:color w:val="000000"/>
-          <w:sz w:val="18"/>
-          <w:szCs w:val="22"/>
-          <w:lang w:eastAsia="ar-SA"/>
-        </w:rPr>
-      </w:pPr>
-      <w:r>
-        <w:rPr>
-          <w:rFonts w:ascii="Arial" w:hAnsi="Arial"/>
-          <w:b/>
-          <w:color w:val="000000"/>
-          <w:sz w:val="18"/>
-          <w:szCs w:val="22"/>
-          <w:lang w:eastAsia="ar-SA"/>
-        </w:rPr>
-        <w:t>Klink LLC, Austin, Texas</w:t>
+        <w:t>April 2016.</w:t>
+      </w:r>
+    </w:p>
+    <w:p>
+      <w:pPr>
+        <w:tabs>
+          <w:tab w:val="left" w:pos="-720"/>
+        </w:tabs>
+        <w:ind w:right="-720"/>
+        <w:rPr>
+          <w:rFonts w:ascii="Arial" w:hAnsi="Arial"/>
+          <w:b/>
+          <w:color w:val="000000"/>
+          <w:sz w:val="18"/>
+          <w:szCs w:val="22"/>
+          <w:lang w:eastAsia="ar-SA"/>
+        </w:rPr>
+      </w:pPr>
+    </w:p>
+    <w:p>
+      <w:pPr>
+        <w:widowControl/>
+        <w:suppressAutoHyphens w:val="0"/>
+        <w:rPr>
+          <w:rFonts w:ascii="Arial" w:hAnsi="Arial"/>
+          <w:b/>
+          <w:color w:val="000000"/>
+          <w:sz w:val="18"/>
+          <w:szCs w:val="22"/>
+          <w:lang w:eastAsia="ar-SA"/>
+        </w:rPr>
+      </w:pPr>
+      <w:r>
+        <w:rPr>
+          <w:rFonts w:ascii="Arial" w:hAnsi="Arial"/>
+          <w:b/>
+          <w:color w:val="000000"/>
+          <w:sz w:val="18"/>
+          <w:szCs w:val="22"/>
+          <w:lang w:eastAsia="ar-SA"/>
+        </w:rPr>
+        <w:t xml:space="preserve">Klink LLC, </w:t>
+      </w:r>
+      <w:r>
+        <w:rPr>
+          <w:rFonts w:ascii="Arial" w:hAnsi="Arial"/>
+          <w:bCs/>
+          <w:color w:val="000000"/>
+          <w:sz w:val="18"/>
+          <w:szCs w:val="22"/>
+          <w:lang w:eastAsia="ar-SA"/>
+        </w:rPr>
+        <w:t>Austin, Texas</w:t>
+      </w:r>
+      <w:r>
+        <w:rPr>
+          <w:rFonts w:ascii="Arial" w:hAnsi="Arial"/>
+          <w:bCs/>
+          <w:color w:val="000000"/>
+          <w:sz w:val="18"/>
+          <w:szCs w:val="22"/>
+          <w:lang w:eastAsia="ar-SA"/>
+        </w:rPr>
+        <w:t>.</w:t>
       </w:r>
     </w:p>
     <w:p>
@@ -1773,17 +2063,17 @@
           <w:szCs w:val="22"/>
           <w:lang w:eastAsia="ar-SA"/>
         </w:rPr>
-        <w:t>August 2013-</w:t>
-      </w:r>
-      <w:r>
-        <w:rPr>
-          <w:rFonts w:ascii="Arial" w:hAnsi="Arial"/>
-          <w:color w:val="000000"/>
-          <w:sz w:val="18"/>
-          <w:szCs w:val="22"/>
-          <w:lang w:eastAsia="ar-SA"/>
-        </w:rPr>
-        <w:t>April 2014</w:t>
+        <w:t>August 2013-April 2014</w:t>
+      </w:r>
+      <w:r>
+        <w:rPr>
+          <w:rFonts w:ascii="Arial" w:hAnsi="Arial"/>
+          <w:color w:val="000000"/>
+          <w:sz w:val="18"/>
+          <w:szCs w:val="22"/>
+          <w:lang w:eastAsia="ar-SA"/>
+        </w:rPr>
+        <w:t>.</w:t>
       </w:r>
     </w:p>
     <w:p>
@@ -1820,6 +2110,8 @@
           <w:lang w:eastAsia="ar-SA"/>
         </w:rPr>
       </w:pPr>
+      <w:bookmarkStart w:id="9" w:name="OLE_LINK11"/>
+      <w:bookmarkStart w:id="10" w:name="OLE_LINK12"/>
       <w:r>
         <w:rPr>
           <w:rFonts w:ascii="Arial" w:hAnsi="Arial"/>
@@ -1848,67 +2140,29 @@
           <w:szCs w:val="22"/>
           <w:lang w:eastAsia="ar-SA"/>
         </w:rPr>
-        <w:t xml:space="preserve"> Obje</w:t>
-      </w:r>
-      <w:r>
-        <w:rPr>
-          <w:rFonts w:ascii="Arial" w:hAnsi="Arial"/>
-          <w:color w:val="000000"/>
-          <w:sz w:val="18"/>
-          <w:szCs w:val="22"/>
-          <w:lang w:eastAsia="ar-SA"/>
-        </w:rPr>
-        <w:t>ctive C,</w:t>
-      </w:r>
-      <w:r>
-        <w:rPr>
-          <w:rFonts w:ascii="Arial" w:hAnsi="Arial"/>
-          <w:color w:val="000000"/>
-          <w:sz w:val="18"/>
-          <w:szCs w:val="22"/>
-          <w:lang w:eastAsia="ar-SA"/>
-        </w:rPr>
-        <w:t xml:space="preserve"> Python </w:t>
-      </w:r>
-      <w:r>
-        <w:rPr>
-          <w:rFonts w:ascii="Arial" w:hAnsi="Arial"/>
-          <w:color w:val="000000"/>
-          <w:sz w:val="18"/>
-          <w:szCs w:val="22"/>
-          <w:lang w:eastAsia="ar-SA"/>
-        </w:rPr>
-        <w:t xml:space="preserve">and PyObjC </w:t>
-      </w:r>
-      <w:r>
-        <w:rPr>
-          <w:rFonts w:ascii="Arial" w:hAnsi="Arial"/>
-          <w:color w:val="000000"/>
-          <w:sz w:val="18"/>
-          <w:szCs w:val="22"/>
-          <w:lang w:eastAsia="ar-SA"/>
-        </w:rPr>
-        <w:t xml:space="preserve">to develop </w:t>
-      </w:r>
-      <w:r>
-        <w:rPr>
-          <w:rFonts w:ascii="Arial" w:hAnsi="Arial"/>
-          <w:color w:val="000000"/>
-          <w:sz w:val="18"/>
-          <w:szCs w:val="22"/>
-          <w:lang w:eastAsia="ar-SA"/>
-        </w:rPr>
-        <w:t>user interface for cloud syncing application</w:t>
-      </w:r>
-      <w:r>
-        <w:rPr>
-          <w:rFonts w:ascii="Arial" w:hAnsi="Arial"/>
-          <w:color w:val="000000"/>
-          <w:sz w:val="18"/>
-          <w:szCs w:val="22"/>
-          <w:lang w:eastAsia="ar-SA"/>
-        </w:rPr>
-        <w:t>.</w:t>
+        <w:t xml:space="preserve"> Objective C, Python and </w:t>
+      </w:r>
+      <w:proofErr w:type="spellStart"/>
+      <w:r>
+        <w:rPr>
+          <w:rFonts w:ascii="Arial" w:hAnsi="Arial"/>
+          <w:color w:val="000000"/>
+          <w:sz w:val="18"/>
+          <w:szCs w:val="22"/>
+          <w:lang w:eastAsia="ar-SA"/>
+        </w:rPr>
+        <w:t>PyObjC</w:t>
+      </w:r>
+      <w:proofErr w:type="spellEnd"/>
+      <w:r>
+        <w:rPr>
+          <w:rFonts w:ascii="Arial" w:hAnsi="Arial"/>
+          <w:color w:val="000000"/>
+          <w:sz w:val="18"/>
+          <w:szCs w:val="22"/>
+          <w:lang w:eastAsia="ar-SA"/>
+        </w:rPr>
+        <w:t xml:space="preserve"> to develop user interface for cloud syncing application.</w:t>
       </w:r>
     </w:p>
     <w:p>
@@ -1991,58 +2245,71 @@
         <w:t>Reduced open bug count by 80%.</w:t>
       </w:r>
     </w:p>
-    <w:p>
-      <w:pPr>
-        <w:tabs>
-          <w:tab w:val="left" w:pos="-720"/>
-        </w:tabs>
-        <w:ind w:right="-720"/>
-        <w:rPr>
-          <w:rFonts w:ascii="Arial" w:hAnsi="Arial"/>
-          <w:b/>
-          <w:color w:val="000000"/>
-          <w:sz w:val="18"/>
-          <w:szCs w:val="22"/>
-          <w:lang w:eastAsia="ar-SA"/>
-        </w:rPr>
-      </w:pPr>
-    </w:p>
-    <w:p>
-      <w:pPr>
-        <w:tabs>
-          <w:tab w:val="left" w:pos="-720"/>
-        </w:tabs>
-        <w:ind w:right="-720"/>
-        <w:rPr>
-          <w:rFonts w:ascii="Arial" w:hAnsi="Arial"/>
-          <w:b/>
-          <w:color w:val="000000"/>
-          <w:sz w:val="18"/>
-          <w:szCs w:val="22"/>
-          <w:lang w:eastAsia="ar-SA"/>
-        </w:rPr>
-      </w:pPr>
-      <w:r>
-        <w:rPr>
-          <w:rFonts w:ascii="Arial" w:hAnsi="Arial"/>
-          <w:b/>
-          <w:color w:val="000000"/>
-          <w:sz w:val="18"/>
-          <w:szCs w:val="22"/>
-          <w:lang w:eastAsia="ar-SA"/>
-        </w:rPr>
-        <w:t>Spawn Labs</w:t>
-      </w:r>
-      <w:r>
-        <w:rPr>
-          <w:rFonts w:ascii="Arial" w:hAnsi="Arial"/>
-          <w:b/>
-          <w:color w:val="000000"/>
-          <w:sz w:val="18"/>
-          <w:szCs w:val="22"/>
-          <w:lang w:eastAsia="ar-SA"/>
-        </w:rPr>
-        <w:t>, Austin, Texas</w:t>
+    <w:bookmarkEnd w:id="9"/>
+    <w:bookmarkEnd w:id="10"/>
+    <w:p>
+      <w:pPr>
+        <w:tabs>
+          <w:tab w:val="left" w:pos="-720"/>
+        </w:tabs>
+        <w:ind w:right="-720"/>
+        <w:rPr>
+          <w:rFonts w:ascii="Arial" w:hAnsi="Arial"/>
+          <w:b/>
+          <w:color w:val="000000"/>
+          <w:sz w:val="18"/>
+          <w:szCs w:val="22"/>
+          <w:lang w:eastAsia="ar-SA"/>
+        </w:rPr>
+      </w:pPr>
+    </w:p>
+    <w:p>
+      <w:pPr>
+        <w:tabs>
+          <w:tab w:val="left" w:pos="-720"/>
+        </w:tabs>
+        <w:ind w:right="-720"/>
+        <w:rPr>
+          <w:rFonts w:ascii="Arial" w:hAnsi="Arial"/>
+          <w:b/>
+          <w:color w:val="000000"/>
+          <w:sz w:val="18"/>
+          <w:szCs w:val="22"/>
+          <w:lang w:eastAsia="ar-SA"/>
+        </w:rPr>
+      </w:pPr>
+      <w:r>
+        <w:rPr>
+          <w:rFonts w:ascii="Arial" w:hAnsi="Arial"/>
+          <w:b/>
+          <w:color w:val="000000"/>
+          <w:sz w:val="18"/>
+          <w:szCs w:val="22"/>
+          <w:lang w:eastAsia="ar-SA"/>
+        </w:rPr>
+        <w:t xml:space="preserve">Spawn Labs, </w:t>
+      </w:r>
+      <w:r>
+        <w:rPr>
+          <w:rFonts w:ascii="Arial" w:hAnsi="Arial"/>
+          <w:bCs/>
+          <w:color w:val="000000"/>
+          <w:sz w:val="18"/>
+          <w:szCs w:val="22"/>
+          <w:lang w:eastAsia="ar-SA"/>
+        </w:rPr>
+        <w:t>Austin, Texas</w:t>
+      </w:r>
+      <w:r>
+        <w:rPr>
+          <w:rFonts w:ascii="Arial" w:hAnsi="Arial"/>
+          <w:bCs/>
+          <w:color w:val="000000"/>
+          <w:sz w:val="18"/>
+          <w:szCs w:val="22"/>
+          <w:lang w:eastAsia="ar-SA"/>
+        </w:rPr>
+        <w:t>.</w:t>
       </w:r>
     </w:p>
     <w:p>
@@ -2078,119 +2345,18 @@
           <w:szCs w:val="22"/>
           <w:lang w:eastAsia="ar-SA"/>
         </w:rPr>
-        <w:t>September 2012-</w:t>
-      </w:r>
-      <w:r>
-        <w:rPr>
-          <w:rFonts w:ascii="Arial" w:hAnsi="Arial"/>
-          <w:color w:val="000000"/>
-          <w:sz w:val="18"/>
-          <w:szCs w:val="22"/>
-          <w:lang w:eastAsia="ar-SA"/>
-        </w:rPr>
-        <w:t>August 2013</w:t>
-      </w:r>
-    </w:p>
-    <w:p>
-      <w:pPr>
-        <w:tabs>
-          <w:tab w:val="left" w:pos="-720"/>
-        </w:tabs>
-        <w:ind w:right="-720"/>
-        <w:rPr>
-          <w:rFonts w:ascii="Arial" w:hAnsi="Arial"/>
-          <w:color w:val="000000"/>
-          <w:sz w:val="18"/>
-          <w:szCs w:val="22"/>
-          <w:lang w:eastAsia="ar-SA"/>
-        </w:rPr>
-      </w:pPr>
-    </w:p>
-    <w:p>
-      <w:pPr>
-        <w:pStyle w:val="ListParagraph"/>
-        <w:numPr>
-          <w:ilvl w:val="0"/>
-          <w:numId w:val="8"/>
-        </w:numPr>
-        <w:tabs>
-          <w:tab w:val="left" w:pos="-720"/>
-        </w:tabs>
-        <w:ind w:right="-720"/>
-        <w:rPr>
-          <w:rFonts w:ascii="Arial" w:hAnsi="Arial"/>
-          <w:color w:val="000000"/>
-          <w:sz w:val="18"/>
-          <w:szCs w:val="22"/>
-          <w:lang w:eastAsia="ar-SA"/>
-        </w:rPr>
-      </w:pPr>
-      <w:r>
-        <w:rPr>
-          <w:rFonts w:ascii="Arial" w:hAnsi="Arial"/>
-          <w:color w:val="000000"/>
-          <w:sz w:val="18"/>
-          <w:szCs w:val="22"/>
-          <w:lang w:eastAsia="ar-SA"/>
-        </w:rPr>
-        <w:t>Standardized builds of embedded operating systems and software for Android, Embedded Linux, Windows 7, and standard Linux using yocto, repo, Android SDK, Java/ant, Visual Studio/msbuild.</w:t>
-      </w:r>
-    </w:p>
-    <w:p>
-      <w:pPr>
-        <w:pStyle w:val="ListParagraph"/>
-        <w:numPr>
-          <w:ilvl w:val="0"/>
-          <w:numId w:val="8"/>
-        </w:numPr>
-        <w:tabs>
-          <w:tab w:val="left" w:pos="-720"/>
-        </w:tabs>
-        <w:ind w:right="-720"/>
-        <w:rPr>
-          <w:rFonts w:ascii="Arial" w:hAnsi="Arial"/>
-          <w:color w:val="000000"/>
-          <w:sz w:val="18"/>
-          <w:szCs w:val="22"/>
-          <w:lang w:eastAsia="ar-SA"/>
-        </w:rPr>
-      </w:pPr>
-      <w:r>
-        <w:rPr>
-          <w:rFonts w:ascii="Arial" w:hAnsi="Arial"/>
-          <w:color w:val="000000"/>
-          <w:sz w:val="18"/>
-          <w:szCs w:val="22"/>
-          <w:lang w:eastAsia="ar-SA"/>
-        </w:rPr>
-        <w:t>Developed automation of RESTful network services usin</w:t>
-      </w:r>
-      <w:r>
-        <w:rPr>
-          <w:rFonts w:ascii="Arial" w:hAnsi="Arial"/>
-          <w:color w:val="000000"/>
-          <w:sz w:val="18"/>
-          <w:szCs w:val="22"/>
-          <w:lang w:eastAsia="ar-SA"/>
-        </w:rPr>
-        <w:t>g vagrant, virtualbox, and ruby as part of continuous integration using Jenkins.</w:t>
-      </w:r>
-    </w:p>
-    <w:p>
-      <w:pPr>
-        <w:tabs>
-          <w:tab w:val="left" w:pos="-720"/>
-        </w:tabs>
-        <w:ind w:right="-720"/>
-        <w:rPr>
-          <w:rFonts w:ascii="Arial" w:hAnsi="Arial"/>
-          <w:b/>
-          <w:color w:val="000000"/>
-          <w:sz w:val="18"/>
-          <w:szCs w:val="22"/>
-          <w:lang w:eastAsia="ar-SA"/>
-        </w:rPr>
-      </w:pPr>
+        <w:t>September 2012-August 2013</w:t>
+      </w:r>
+      <w:r>
+        <w:rPr>
+          <w:rFonts w:ascii="Arial" w:hAnsi="Arial"/>
+          <w:color w:val="000000"/>
+          <w:sz w:val="18"/>
+          <w:szCs w:val="22"/>
+          <w:lang w:eastAsia="ar-SA"/>
+        </w:rPr>
+        <w:t>.</w:t>
+      </w:r>
     </w:p>
     <w:p>
       <w:pPr>
@@ -2205,84 +2371,98 @@
           <w:lang w:eastAsia="ar-SA"/>
         </w:rPr>
       </w:pPr>
-      <w:r>
-        <w:rPr>
-          <w:rFonts w:ascii="Arial" w:hAnsi="Arial"/>
-          <w:b/>
-          <w:color w:val="000000"/>
-          <w:sz w:val="18"/>
-          <w:szCs w:val="22"/>
-          <w:lang w:eastAsia="ar-SA"/>
-        </w:rPr>
-        <w:t>Rock Systems, Durango, Colorado</w:t>
-      </w:r>
-    </w:p>
-    <w:p>
-      <w:pPr>
-        <w:tabs>
-          <w:tab w:val="left" w:pos="-720"/>
-        </w:tabs>
-        <w:ind w:right="-720"/>
-        <w:rPr>
-          <w:rFonts w:ascii="Arial" w:hAnsi="Arial"/>
-          <w:color w:val="000000"/>
-          <w:sz w:val="18"/>
-          <w:szCs w:val="22"/>
-          <w:lang w:eastAsia="ar-SA"/>
-        </w:rPr>
-      </w:pPr>
-      <w:r>
-        <w:rPr>
-          <w:rFonts w:ascii="Arial" w:hAnsi="Arial"/>
-          <w:b/>
-          <w:color w:val="000000"/>
-          <w:sz w:val="18"/>
-          <w:szCs w:val="22"/>
-          <w:lang w:eastAsia="ar-SA"/>
-        </w:rPr>
-        <w:t xml:space="preserve">Consultant – iOS </w:t>
-      </w:r>
-      <w:r>
-        <w:rPr>
-          <w:rFonts w:ascii="Arial" w:hAnsi="Arial"/>
-          <w:b/>
-          <w:color w:val="000000"/>
-          <w:sz w:val="18"/>
-          <w:szCs w:val="22"/>
-          <w:lang w:eastAsia="ar-SA"/>
-        </w:rPr>
-        <w:t>Development</w:t>
-      </w:r>
-      <w:r>
-        <w:rPr>
-          <w:rFonts w:ascii="Arial" w:hAnsi="Arial"/>
-          <w:b/>
-          <w:color w:val="000000"/>
-          <w:sz w:val="18"/>
-          <w:szCs w:val="22"/>
-          <w:lang w:eastAsia="ar-SA"/>
-        </w:rPr>
-        <w:t xml:space="preserve">, </w:t>
-      </w:r>
-      <w:r>
-        <w:rPr>
-          <w:rFonts w:ascii="Arial" w:hAnsi="Arial"/>
-          <w:color w:val="000000"/>
-          <w:sz w:val="18"/>
-          <w:szCs w:val="22"/>
-          <w:lang w:eastAsia="ar-SA"/>
-        </w:rPr>
-        <w:t>April</w:t>
-      </w:r>
-      <w:r>
-        <w:rPr>
-          <w:rFonts w:ascii="Arial" w:hAnsi="Arial"/>
-          <w:color w:val="000000"/>
-          <w:sz w:val="18"/>
-          <w:szCs w:val="22"/>
-          <w:lang w:eastAsia="ar-SA"/>
-        </w:rPr>
-        <w:t xml:space="preserve"> 2012-August 2012</w:t>
+    </w:p>
+    <w:p>
+      <w:pPr>
+        <w:widowControl/>
+        <w:suppressAutoHyphens w:val="0"/>
+        <w:rPr>
+          <w:rFonts w:ascii="Arial" w:hAnsi="Arial"/>
+          <w:b/>
+          <w:color w:val="000000"/>
+          <w:sz w:val="18"/>
+          <w:szCs w:val="22"/>
+          <w:lang w:eastAsia="ar-SA"/>
+        </w:rPr>
+      </w:pPr>
+      <w:r>
+        <w:rPr>
+          <w:rFonts w:ascii="Arial" w:hAnsi="Arial"/>
+          <w:b/>
+          <w:color w:val="000000"/>
+          <w:sz w:val="18"/>
+          <w:szCs w:val="22"/>
+          <w:lang w:eastAsia="ar-SA"/>
+        </w:rPr>
+        <w:t xml:space="preserve">Rock Systems, </w:t>
+      </w:r>
+      <w:r>
+        <w:rPr>
+          <w:rFonts w:ascii="Arial" w:hAnsi="Arial"/>
+          <w:bCs/>
+          <w:color w:val="000000"/>
+          <w:sz w:val="18"/>
+          <w:szCs w:val="22"/>
+          <w:lang w:eastAsia="ar-SA"/>
+        </w:rPr>
+        <w:t>Durango, Colorado</w:t>
+      </w:r>
+      <w:r>
+        <w:rPr>
+          <w:rFonts w:ascii="Arial" w:hAnsi="Arial"/>
+          <w:bCs/>
+          <w:color w:val="000000"/>
+          <w:sz w:val="18"/>
+          <w:szCs w:val="22"/>
+          <w:lang w:eastAsia="ar-SA"/>
+        </w:rPr>
+        <w:t xml:space="preserve"> (remote).</w:t>
+      </w:r>
+    </w:p>
+    <w:p>
+      <w:pPr>
+        <w:tabs>
+          <w:tab w:val="left" w:pos="-720"/>
+        </w:tabs>
+        <w:ind w:right="-720"/>
+        <w:rPr>
+          <w:rFonts w:ascii="Arial" w:hAnsi="Arial"/>
+          <w:color w:val="000000"/>
+          <w:sz w:val="18"/>
+          <w:szCs w:val="22"/>
+          <w:lang w:eastAsia="ar-SA"/>
+        </w:rPr>
+      </w:pPr>
+      <w:r>
+        <w:rPr>
+          <w:rFonts w:ascii="Arial" w:hAnsi="Arial"/>
+          <w:b/>
+          <w:color w:val="000000"/>
+          <w:sz w:val="18"/>
+          <w:szCs w:val="22"/>
+          <w:lang w:eastAsia="ar-SA"/>
+        </w:rPr>
+        <w:t xml:space="preserve">Consultant – iOS Development, </w:t>
+      </w:r>
+      <w:r>
+        <w:rPr>
+          <w:rFonts w:ascii="Arial" w:hAnsi="Arial"/>
+          <w:color w:val="000000"/>
+          <w:sz w:val="18"/>
+          <w:szCs w:val="22"/>
+          <w:lang w:eastAsia="ar-SA"/>
+        </w:rPr>
+        <w:t>April 2012-August 2012</w:t>
+      </w:r>
+      <w:r>
+        <w:rPr>
+          <w:rFonts w:ascii="Arial" w:hAnsi="Arial"/>
+          <w:color w:val="000000"/>
+          <w:sz w:val="18"/>
+          <w:szCs w:val="22"/>
+          <w:lang w:eastAsia="ar-SA"/>
+        </w:rPr>
+        <w:t>.</w:t>
       </w:r>
     </w:p>
     <w:p>
@@ -2321,6 +2501,8 @@
           <w:lang w:eastAsia="ar-SA"/>
         </w:rPr>
       </w:pPr>
+      <w:bookmarkStart w:id="11" w:name="OLE_LINK15"/>
+      <w:bookmarkStart w:id="12" w:name="OLE_LINK16"/>
       <w:r>
         <w:rPr>
           <w:rFonts w:ascii="Arial" w:hAnsi="Arial"/>
@@ -2339,29 +2521,49 @@
           <w:szCs w:val="22"/>
           <w:lang w:eastAsia="ar-SA"/>
         </w:rPr>
-        <w:t xml:space="preserve"> in Airborne Media </w:t>
-      </w:r>
-      <w:proofErr w:type="spellStart"/>
-      <w:r>
-        <w:rPr>
-          <w:rFonts w:ascii="Arial" w:hAnsi="Arial"/>
-          <w:color w:val="000000"/>
-          <w:sz w:val="18"/>
-          <w:szCs w:val="22"/>
-          <w:lang w:eastAsia="ar-SA"/>
-        </w:rPr>
-        <w:t>Groups’s</w:t>
-      </w:r>
-      <w:proofErr w:type="spellEnd"/>
-      <w:r>
-        <w:rPr>
-          <w:rFonts w:ascii="Arial" w:hAnsi="Arial"/>
-          <w:color w:val="000000"/>
-          <w:sz w:val="18"/>
-          <w:szCs w:val="22"/>
-          <w:lang w:eastAsia="ar-SA"/>
-        </w:rPr>
-        <w:t xml:space="preserve"> Audio Air app</w:t>
+        <w:t xml:space="preserve"> in Airborne Media Group’s </w:t>
+      </w:r>
+      <w:r>
+        <w:rPr>
+          <w:rFonts w:ascii="Arial" w:hAnsi="Arial"/>
+          <w:b/>
+          <w:bCs/>
+          <w:color w:val="000000"/>
+          <w:sz w:val="18"/>
+          <w:szCs w:val="22"/>
+          <w:lang w:eastAsia="ar-SA"/>
+        </w:rPr>
+        <w:t>Audio Air</w:t>
+      </w:r>
+      <w:r>
+        <w:rPr>
+          <w:rFonts w:ascii="Arial" w:hAnsi="Arial"/>
+          <w:color w:val="000000"/>
+          <w:sz w:val="18"/>
+          <w:szCs w:val="22"/>
+          <w:lang w:eastAsia="ar-SA"/>
+        </w:rPr>
+        <w:t xml:space="preserve"> </w:t>
+      </w:r>
+      <w:r>
+        <w:rPr>
+          <w:rFonts w:ascii="Arial" w:hAnsi="Arial"/>
+          <w:color w:val="000000"/>
+          <w:sz w:val="18"/>
+          <w:szCs w:val="22"/>
+          <w:lang w:eastAsia="ar-SA"/>
+        </w:rPr>
+        <w:t>i</w:t>
+      </w:r>
+      <w:r>
+        <w:rPr>
+          <w:rFonts w:ascii="Arial" w:hAnsi="Arial"/>
+          <w:color w:val="000000"/>
+          <w:sz w:val="18"/>
+          <w:szCs w:val="22"/>
+          <w:lang w:eastAsia="ar-SA"/>
+        </w:rPr>
+        <w:t>OS app (now discontinued)</w:t>
       </w:r>
       <w:r>
         <w:rPr>
@@ -2402,138 +2604,59 @@
           <w:szCs w:val="22"/>
           <w:lang w:eastAsia="ar-SA"/>
         </w:rPr>
-        <w:t xml:space="preserve">Added a </w:t>
-      </w:r>
-      <w:r>
-        <w:rPr>
-          <w:rFonts w:ascii="Arial" w:hAnsi="Arial"/>
-          <w:color w:val="000000"/>
-          <w:sz w:val="18"/>
-          <w:szCs w:val="22"/>
-          <w:lang w:eastAsia="ar-SA"/>
-        </w:rPr>
-        <w:t xml:space="preserve">DirecTV </w:t>
-      </w:r>
-      <w:r>
-        <w:rPr>
-          <w:rFonts w:ascii="Arial" w:hAnsi="Arial"/>
-          <w:color w:val="000000"/>
-          <w:sz w:val="18"/>
-          <w:szCs w:val="22"/>
-          <w:lang w:eastAsia="ar-SA"/>
-        </w:rPr>
-        <w:t>channel display feature.</w:t>
-      </w:r>
-    </w:p>
-    <w:p>
-      <w:pPr>
-        <w:pStyle w:val="ListParagraph"/>
-        <w:numPr>
-          <w:ilvl w:val="0"/>
-          <w:numId w:val="9"/>
-        </w:numPr>
-        <w:tabs>
-          <w:tab w:val="left" w:pos="-720"/>
-        </w:tabs>
-        <w:ind w:right="-720"/>
-        <w:rPr>
-          <w:rFonts w:ascii="Arial" w:hAnsi="Arial"/>
-          <w:b/>
-          <w:color w:val="000000"/>
-          <w:sz w:val="18"/>
-          <w:szCs w:val="22"/>
-          <w:lang w:eastAsia="ar-SA"/>
-        </w:rPr>
-      </w:pPr>
-      <w:r>
-        <w:rPr>
-          <w:rFonts w:ascii="Arial" w:hAnsi="Arial"/>
-          <w:color w:val="000000"/>
-          <w:sz w:val="18"/>
-          <w:szCs w:val="22"/>
-          <w:lang w:eastAsia="ar-SA"/>
-        </w:rPr>
         <w:t>Version 1.3 shipped in the App Store in September 2012.</w:t>
       </w:r>
     </w:p>
-    <w:p>
-      <w:pPr>
-        <w:tabs>
-          <w:tab w:val="left" w:pos="-720"/>
-        </w:tabs>
-        <w:ind w:right="-720"/>
-        <w:rPr>
-          <w:rFonts w:ascii="Arial" w:hAnsi="Arial"/>
-          <w:b/>
-          <w:color w:val="000000"/>
-          <w:sz w:val="18"/>
-          <w:szCs w:val="22"/>
-          <w:lang w:eastAsia="ar-SA"/>
-        </w:rPr>
-      </w:pPr>
-    </w:p>
-    <w:p>
-      <w:pPr>
-        <w:tabs>
-          <w:tab w:val="left" w:pos="-720"/>
-        </w:tabs>
-        <w:ind w:right="-720"/>
-        <w:rPr>
-          <w:rFonts w:ascii="Arial" w:hAnsi="Arial"/>
-          <w:b/>
-          <w:color w:val="000000"/>
-          <w:sz w:val="18"/>
-          <w:szCs w:val="22"/>
-          <w:lang w:eastAsia="ar-SA"/>
-        </w:rPr>
-      </w:pPr>
-      <w:r>
-        <w:rPr>
-          <w:rFonts w:ascii="Arial" w:hAnsi="Arial"/>
-          <w:b/>
-          <w:color w:val="000000"/>
-          <w:sz w:val="18"/>
-          <w:szCs w:val="22"/>
-          <w:lang w:eastAsia="ar-SA"/>
-        </w:rPr>
-        <w:t>Coverity Software, San Francisco, California</w:t>
-      </w:r>
-    </w:p>
-    <w:p>
-      <w:pPr>
-        <w:tabs>
-          <w:tab w:val="left" w:pos="-720"/>
-        </w:tabs>
-        <w:ind w:right="-720"/>
-        <w:rPr>
-          <w:rFonts w:ascii="Arial" w:hAnsi="Arial"/>
-          <w:color w:val="000000"/>
-          <w:sz w:val="18"/>
-          <w:szCs w:val="22"/>
-          <w:lang w:eastAsia="ar-SA"/>
-        </w:rPr>
-      </w:pPr>
-      <w:r>
-        <w:rPr>
-          <w:rFonts w:ascii="Arial" w:hAnsi="Arial"/>
-          <w:b/>
-          <w:color w:val="000000"/>
-          <w:sz w:val="18"/>
-          <w:szCs w:val="22"/>
-          <w:lang w:eastAsia="ar-SA"/>
-        </w:rPr>
-        <w:t xml:space="preserve">Senior QA Manager and </w:t>
-      </w:r>
-      <w:r>
-        <w:rPr>
-          <w:rFonts w:ascii="Arial" w:hAnsi="Arial"/>
-          <w:b/>
-          <w:color w:val="000000"/>
-          <w:sz w:val="18"/>
-          <w:szCs w:val="22"/>
-          <w:lang w:eastAsia="ar-SA"/>
-        </w:rPr>
-        <w:t>QA Architect</w:t>
+    <w:bookmarkEnd w:id="11"/>
+    <w:bookmarkEnd w:id="12"/>
+    <w:p>
+      <w:pPr>
+        <w:widowControl/>
+        <w:suppressAutoHyphens w:val="0"/>
+        <w:rPr>
+          <w:rFonts w:ascii="Arial" w:hAnsi="Arial"/>
+          <w:b/>
+          <w:color w:val="000000"/>
+          <w:sz w:val="18"/>
+          <w:szCs w:val="22"/>
+          <w:lang w:eastAsia="ar-SA"/>
+        </w:rPr>
+      </w:pPr>
+    </w:p>
+    <w:p>
+      <w:pPr>
+        <w:widowControl/>
+        <w:suppressAutoHyphens w:val="0"/>
+        <w:rPr>
+          <w:rFonts w:ascii="Arial" w:hAnsi="Arial"/>
+          <w:b/>
+          <w:color w:val="000000"/>
+          <w:sz w:val="18"/>
+          <w:szCs w:val="22"/>
+          <w:lang w:eastAsia="ar-SA"/>
+        </w:rPr>
+      </w:pPr>
+      <w:r>
+        <w:rPr>
+          <w:rFonts w:ascii="Arial" w:hAnsi="Arial"/>
+          <w:b/>
+          <w:color w:val="000000"/>
+          <w:sz w:val="18"/>
+          <w:szCs w:val="22"/>
+          <w:lang w:eastAsia="ar-SA"/>
+        </w:rPr>
+        <w:t>Coverity Software</w:t>
+      </w:r>
+      <w:r>
+        <w:rPr>
+          <w:rFonts w:ascii="Arial" w:hAnsi="Arial"/>
+          <w:b/>
+          <w:color w:val="000000"/>
+          <w:sz w:val="18"/>
+          <w:szCs w:val="22"/>
+          <w:lang w:eastAsia="ar-SA"/>
+        </w:rPr>
+        <w:t xml:space="preserve"> (now Synopsis)</w:t>
       </w:r>
       <w:r>
         <w:rPr>
@@ -2549,87 +2672,125 @@
       <w:r>
         <w:rPr>
           <w:rFonts w:ascii="Arial" w:hAnsi="Arial"/>
-          <w:color w:val="000000"/>
-          <w:sz w:val="18"/>
-          <w:szCs w:val="22"/>
-          <w:lang w:eastAsia="ar-SA"/>
-        </w:rPr>
-        <w:t>July 2008-</w:t>
-      </w:r>
-      <w:r>
-        <w:rPr>
-          <w:rFonts w:ascii="Arial" w:hAnsi="Arial"/>
-          <w:color w:val="000000"/>
-          <w:sz w:val="18"/>
-          <w:szCs w:val="22"/>
-          <w:lang w:eastAsia="ar-SA"/>
-        </w:rPr>
-        <w:t>May 2012</w:t>
-      </w:r>
-    </w:p>
-    <w:p>
-      <w:pPr>
-        <w:tabs>
-          <w:tab w:val="left" w:pos="-720"/>
-        </w:tabs>
-        <w:ind w:right="-720"/>
-        <w:rPr>
-          <w:rFonts w:ascii="Arial" w:hAnsi="Arial"/>
-          <w:b/>
-          <w:color w:val="000000"/>
-          <w:sz w:val="18"/>
-          <w:szCs w:val="22"/>
-          <w:lang w:eastAsia="ar-SA"/>
-        </w:rPr>
-      </w:pPr>
-    </w:p>
-    <w:p>
-      <w:pPr>
-        <w:tabs>
-          <w:tab w:val="left" w:pos="-720"/>
-        </w:tabs>
-        <w:ind w:right="-720"/>
-        <w:rPr>
-          <w:rFonts w:ascii="Arial" w:hAnsi="Arial"/>
-          <w:b/>
-          <w:color w:val="000000"/>
-          <w:sz w:val="18"/>
-          <w:szCs w:val="22"/>
-          <w:lang w:eastAsia="ar-SA"/>
-        </w:rPr>
-      </w:pPr>
-      <w:r>
-        <w:rPr>
-          <w:rFonts w:ascii="Arial" w:hAnsi="Arial"/>
-          <w:b/>
-          <w:color w:val="000000"/>
-          <w:sz w:val="18"/>
-          <w:szCs w:val="22"/>
-          <w:lang w:eastAsia="ar-SA"/>
-        </w:rPr>
-        <w:t>Lombardi Software</w:t>
-      </w:r>
-      <w:r>
-        <w:rPr>
-          <w:rFonts w:ascii="Arial" w:hAnsi="Arial"/>
-          <w:b/>
-          <w:color w:val="000000"/>
-          <w:sz w:val="18"/>
-          <w:szCs w:val="22"/>
-          <w:lang w:eastAsia="ar-SA"/>
-        </w:rPr>
-        <w:t xml:space="preserve"> (now IBM)</w:t>
-      </w:r>
-      <w:r>
-        <w:rPr>
-          <w:rFonts w:ascii="Arial" w:hAnsi="Arial"/>
-          <w:b/>
-          <w:color w:val="000000"/>
-          <w:sz w:val="18"/>
-          <w:szCs w:val="22"/>
-          <w:lang w:eastAsia="ar-SA"/>
-        </w:rPr>
-        <w:t>, Austin, Texas</w:t>
+          <w:bCs/>
+          <w:color w:val="000000"/>
+          <w:sz w:val="18"/>
+          <w:szCs w:val="22"/>
+          <w:lang w:eastAsia="ar-SA"/>
+        </w:rPr>
+        <w:t>San Francisco, California</w:t>
+      </w:r>
+      <w:r>
+        <w:rPr>
+          <w:rFonts w:ascii="Arial" w:hAnsi="Arial"/>
+          <w:bCs/>
+          <w:color w:val="000000"/>
+          <w:sz w:val="18"/>
+          <w:szCs w:val="22"/>
+          <w:lang w:eastAsia="ar-SA"/>
+        </w:rPr>
+        <w:t xml:space="preserve"> (remote).</w:t>
+      </w:r>
+    </w:p>
+    <w:p>
+      <w:pPr>
+        <w:tabs>
+          <w:tab w:val="left" w:pos="-720"/>
+        </w:tabs>
+        <w:ind w:right="-720"/>
+        <w:rPr>
+          <w:rFonts w:ascii="Arial" w:hAnsi="Arial"/>
+          <w:color w:val="000000"/>
+          <w:sz w:val="18"/>
+          <w:szCs w:val="22"/>
+          <w:lang w:eastAsia="ar-SA"/>
+        </w:rPr>
+      </w:pPr>
+      <w:r>
+        <w:rPr>
+          <w:rFonts w:ascii="Arial" w:hAnsi="Arial"/>
+          <w:b/>
+          <w:color w:val="000000"/>
+          <w:sz w:val="18"/>
+          <w:szCs w:val="22"/>
+          <w:lang w:eastAsia="ar-SA"/>
+        </w:rPr>
+        <w:t xml:space="preserve">Senior QA Manager and QA Architect, </w:t>
+      </w:r>
+      <w:r>
+        <w:rPr>
+          <w:rFonts w:ascii="Arial" w:hAnsi="Arial"/>
+          <w:color w:val="000000"/>
+          <w:sz w:val="18"/>
+          <w:szCs w:val="22"/>
+          <w:lang w:eastAsia="ar-SA"/>
+        </w:rPr>
+        <w:t>July 2008-May 2012</w:t>
+      </w:r>
+    </w:p>
+    <w:p>
+      <w:pPr>
+        <w:tabs>
+          <w:tab w:val="left" w:pos="-720"/>
+        </w:tabs>
+        <w:ind w:right="-720"/>
+        <w:rPr>
+          <w:rFonts w:ascii="Arial" w:hAnsi="Arial"/>
+          <w:b/>
+          <w:color w:val="000000"/>
+          <w:sz w:val="18"/>
+          <w:szCs w:val="22"/>
+          <w:lang w:eastAsia="ar-SA"/>
+        </w:rPr>
+      </w:pPr>
+    </w:p>
+    <w:p>
+      <w:pPr>
+        <w:tabs>
+          <w:tab w:val="left" w:pos="-720"/>
+        </w:tabs>
+        <w:ind w:right="-720"/>
+        <w:rPr>
+          <w:rFonts w:ascii="Arial" w:hAnsi="Arial"/>
+          <w:b/>
+          <w:color w:val="000000"/>
+          <w:sz w:val="18"/>
+          <w:szCs w:val="22"/>
+          <w:lang w:eastAsia="ar-SA"/>
+        </w:rPr>
+      </w:pPr>
+      <w:r>
+        <w:rPr>
+          <w:rFonts w:ascii="Arial" w:hAnsi="Arial"/>
+          <w:b/>
+          <w:color w:val="000000"/>
+          <w:sz w:val="18"/>
+          <w:szCs w:val="22"/>
+          <w:lang w:eastAsia="ar-SA"/>
+        </w:rPr>
+        <w:t xml:space="preserve">Lombardi Software (now IBM), </w:t>
+      </w:r>
+      <w:r>
+        <w:rPr>
+          <w:rFonts w:ascii="Arial" w:hAnsi="Arial"/>
+          <w:bCs/>
+          <w:color w:val="000000"/>
+          <w:sz w:val="18"/>
+          <w:szCs w:val="22"/>
+          <w:lang w:eastAsia="ar-SA"/>
+        </w:rPr>
+        <w:t>Austin, Texas</w:t>
+      </w:r>
+      <w:r>
+        <w:rPr>
+          <w:rFonts w:ascii="Arial" w:hAnsi="Arial"/>
+          <w:bCs/>
+          <w:color w:val="000000"/>
+          <w:sz w:val="18"/>
+          <w:szCs w:val="22"/>
+          <w:lang w:eastAsia="ar-SA"/>
+        </w:rPr>
+        <w:t>.</w:t>
       </w:r>
     </w:p>
     <w:p>
@@ -2707,29 +2868,29 @@
           <w:szCs w:val="22"/>
           <w:lang w:eastAsia="ar-SA"/>
         </w:rPr>
-        <w:t>Apple Computer</w:t>
-      </w:r>
-      <w:r>
-        <w:rPr>
-          <w:rFonts w:ascii="Arial" w:hAnsi="Arial"/>
-          <w:b/>
-          <w:color w:val="000000"/>
-          <w:sz w:val="18"/>
-          <w:szCs w:val="22"/>
-          <w:lang w:eastAsia="ar-SA"/>
-        </w:rPr>
-        <w:t xml:space="preserve"> (now Apple, Inc.)</w:t>
-      </w:r>
-      <w:r>
-        <w:rPr>
-          <w:rFonts w:ascii="Arial" w:hAnsi="Arial"/>
-          <w:b/>
-          <w:color w:val="000000"/>
-          <w:sz w:val="18"/>
-          <w:szCs w:val="22"/>
-          <w:lang w:eastAsia="ar-SA"/>
-        </w:rPr>
-        <w:t>, Cupertino, California</w:t>
+        <w:t xml:space="preserve">Apple Computer (now Apple, Inc.), </w:t>
+      </w:r>
+      <w:r>
+        <w:rPr>
+          <w:rFonts w:ascii="Arial" w:hAnsi="Arial"/>
+          <w:bCs/>
+          <w:color w:val="000000"/>
+          <w:sz w:val="18"/>
+          <w:szCs w:val="22"/>
+          <w:lang w:eastAsia="ar-SA"/>
+        </w:rPr>
+        <w:t>Cupertino, California</w:t>
+      </w:r>
+      <w:r>
+        <w:rPr>
+          <w:rFonts w:ascii="Arial" w:hAnsi="Arial"/>
+          <w:bCs/>
+          <w:color w:val="000000"/>
+          <w:sz w:val="18"/>
+          <w:szCs w:val="22"/>
+          <w:lang w:eastAsia="ar-SA"/>
+        </w:rPr>
+        <w:t>.</w:t>
       </w:r>
     </w:p>
     <w:p>
@@ -2765,519 +2926,740 @@
           <w:szCs w:val="22"/>
           <w:lang w:eastAsia="ar-SA"/>
         </w:rPr>
+        <w:t>, May 2001-April 2006</w:t>
+      </w:r>
+    </w:p>
+    <w:p>
+      <w:pPr>
+        <w:tabs>
+          <w:tab w:val="left" w:pos="-720"/>
+        </w:tabs>
+        <w:ind w:right="-720"/>
+        <w:rPr>
+          <w:rFonts w:ascii="Arial" w:hAnsi="Arial"/>
+          <w:b/>
+          <w:color w:val="000000"/>
+          <w:sz w:val="18"/>
+          <w:szCs w:val="22"/>
+          <w:lang w:eastAsia="ar-SA"/>
+        </w:rPr>
+      </w:pPr>
+    </w:p>
+    <w:p>
+      <w:pPr>
+        <w:tabs>
+          <w:tab w:val="left" w:pos="-720"/>
+        </w:tabs>
+        <w:ind w:right="-720"/>
+        <w:rPr>
+          <w:rFonts w:ascii="Arial" w:hAnsi="Arial"/>
+          <w:b/>
+          <w:color w:val="000000"/>
+          <w:sz w:val="18"/>
+          <w:szCs w:val="22"/>
+          <w:lang w:eastAsia="ar-SA"/>
+        </w:rPr>
+      </w:pPr>
+      <w:r>
+        <w:rPr>
+          <w:rFonts w:ascii="Arial" w:hAnsi="Arial"/>
+          <w:b/>
+          <w:color w:val="000000"/>
+          <w:sz w:val="18"/>
+          <w:szCs w:val="22"/>
+          <w:lang w:eastAsia="ar-SA"/>
+        </w:rPr>
+        <w:t>Red Hat, Inc.</w:t>
+      </w:r>
+      <w:r>
+        <w:rPr>
+          <w:rFonts w:ascii="Arial" w:hAnsi="Arial"/>
+          <w:b/>
+          <w:color w:val="000000"/>
+          <w:sz w:val="18"/>
+          <w:szCs w:val="22"/>
+          <w:lang w:eastAsia="ar-SA"/>
+        </w:rPr>
+        <w:t>/</w:t>
+      </w:r>
+      <w:r>
+        <w:rPr>
+          <w:rFonts w:ascii="Arial" w:hAnsi="Arial"/>
+          <w:b/>
+          <w:color w:val="000000"/>
+          <w:sz w:val="18"/>
+          <w:szCs w:val="22"/>
+          <w:lang w:eastAsia="ar-SA"/>
+        </w:rPr>
+        <w:t xml:space="preserve">Cygnus Solutions, </w:t>
+      </w:r>
+      <w:r>
+        <w:rPr>
+          <w:rFonts w:ascii="Arial" w:hAnsi="Arial"/>
+          <w:bCs/>
+          <w:color w:val="000000"/>
+          <w:sz w:val="18"/>
+          <w:szCs w:val="22"/>
+          <w:lang w:eastAsia="ar-SA"/>
+        </w:rPr>
+        <w:t>Sunnyvale, California</w:t>
+      </w:r>
+      <w:r>
+        <w:rPr>
+          <w:rFonts w:ascii="Arial" w:hAnsi="Arial"/>
+          <w:bCs/>
+          <w:color w:val="000000"/>
+          <w:sz w:val="18"/>
+          <w:szCs w:val="22"/>
+          <w:lang w:eastAsia="ar-SA"/>
+        </w:rPr>
+        <w:t>.</w:t>
+      </w:r>
+    </w:p>
+    <w:p>
+      <w:pPr>
+        <w:tabs>
+          <w:tab w:val="left" w:pos="-720"/>
+        </w:tabs>
+        <w:ind w:right="-720"/>
+        <w:rPr>
+          <w:rFonts w:ascii="Arial" w:hAnsi="Arial"/>
+          <w:color w:val="000000"/>
+          <w:sz w:val="18"/>
+          <w:szCs w:val="22"/>
+          <w:lang w:eastAsia="ar-SA"/>
+        </w:rPr>
+      </w:pPr>
+      <w:r>
+        <w:rPr>
+          <w:rFonts w:ascii="Arial" w:hAnsi="Arial"/>
+          <w:b/>
+          <w:color w:val="000000"/>
+          <w:sz w:val="18"/>
+          <w:szCs w:val="22"/>
+          <w:lang w:eastAsia="ar-SA"/>
+        </w:rPr>
+        <w:t>Engineering Manager</w:t>
+      </w:r>
+      <w:r>
+        <w:rPr>
+          <w:rFonts w:ascii="Arial" w:hAnsi="Arial"/>
+          <w:color w:val="000000"/>
+          <w:sz w:val="18"/>
+          <w:szCs w:val="22"/>
+          <w:lang w:eastAsia="ar-SA"/>
+        </w:rPr>
+        <w:t>, November 1997-May 2001</w:t>
+      </w:r>
+    </w:p>
+    <w:p>
+      <w:pPr>
+        <w:tabs>
+          <w:tab w:val="left" w:pos="-720"/>
+        </w:tabs>
+        <w:ind w:right="-720"/>
+        <w:rPr>
+          <w:rFonts w:ascii="Arial" w:hAnsi="Arial"/>
+          <w:b/>
+          <w:color w:val="000000"/>
+          <w:sz w:val="18"/>
+          <w:szCs w:val="22"/>
+          <w:lang w:eastAsia="ar-SA"/>
+        </w:rPr>
+      </w:pPr>
+    </w:p>
+    <w:p>
+      <w:pPr>
+        <w:tabs>
+          <w:tab w:val="left" w:pos="-720"/>
+        </w:tabs>
+        <w:ind w:right="-720"/>
+        <w:rPr>
+          <w:rFonts w:ascii="Arial" w:hAnsi="Arial"/>
+          <w:b/>
+          <w:color w:val="000000"/>
+          <w:sz w:val="18"/>
+          <w:szCs w:val="22"/>
+          <w:lang w:eastAsia="ar-SA"/>
+        </w:rPr>
+      </w:pPr>
+      <w:r>
+        <w:rPr>
+          <w:rFonts w:ascii="Arial" w:hAnsi="Arial"/>
+          <w:b/>
+          <w:color w:val="000000"/>
+          <w:sz w:val="18"/>
+          <w:szCs w:val="22"/>
+          <w:lang w:eastAsia="ar-SA"/>
+        </w:rPr>
+        <w:t>Sun Microsystems Laboratories</w:t>
+      </w:r>
+      <w:r>
+        <w:rPr>
+          <w:rFonts w:ascii="Arial" w:hAnsi="Arial"/>
+          <w:b/>
+          <w:color w:val="000000"/>
+          <w:sz w:val="18"/>
+          <w:szCs w:val="22"/>
+          <w:lang w:eastAsia="ar-SA"/>
+        </w:rPr>
+        <w:t xml:space="preserve"> (now Oracle Laboratories)</w:t>
+      </w:r>
+      <w:r>
+        <w:rPr>
+          <w:rFonts w:ascii="Arial" w:hAnsi="Arial"/>
+          <w:b/>
+          <w:color w:val="000000"/>
+          <w:sz w:val="18"/>
+          <w:szCs w:val="22"/>
+          <w:lang w:eastAsia="ar-SA"/>
+        </w:rPr>
         <w:t xml:space="preserve">, </w:t>
       </w:r>
       <w:r>
         <w:rPr>
           <w:rFonts w:ascii="Arial" w:hAnsi="Arial"/>
-          <w:color w:val="000000"/>
-          <w:sz w:val="18"/>
-          <w:szCs w:val="22"/>
-          <w:lang w:eastAsia="ar-SA"/>
-        </w:rPr>
-        <w:t>May</w:t>
-      </w:r>
-      <w:r>
-        <w:rPr>
-          <w:rFonts w:ascii="Arial" w:hAnsi="Arial"/>
-          <w:color w:val="000000"/>
-          <w:sz w:val="18"/>
-          <w:szCs w:val="22"/>
-          <w:lang w:eastAsia="ar-SA"/>
-        </w:rPr>
-        <w:t xml:space="preserve"> 2001-April 2006</w:t>
-      </w:r>
-    </w:p>
-    <w:p>
-      <w:pPr>
-        <w:tabs>
-          <w:tab w:val="left" w:pos="-720"/>
-        </w:tabs>
-        <w:ind w:right="-720"/>
-        <w:rPr>
-          <w:rFonts w:ascii="Arial" w:hAnsi="Arial"/>
-          <w:b/>
-          <w:color w:val="000000"/>
-          <w:sz w:val="18"/>
-          <w:szCs w:val="22"/>
-          <w:lang w:eastAsia="ar-SA"/>
-        </w:rPr>
-      </w:pPr>
-    </w:p>
-    <w:p>
-      <w:pPr>
-        <w:tabs>
-          <w:tab w:val="left" w:pos="-720"/>
-        </w:tabs>
-        <w:ind w:right="-720"/>
-        <w:rPr>
-          <w:rFonts w:ascii="Arial" w:hAnsi="Arial"/>
-          <w:b/>
-          <w:color w:val="000000"/>
-          <w:sz w:val="18"/>
-          <w:szCs w:val="22"/>
-          <w:lang w:eastAsia="ar-SA"/>
-        </w:rPr>
-      </w:pPr>
-      <w:r>
-        <w:rPr>
-          <w:rFonts w:ascii="Arial" w:hAnsi="Arial"/>
-          <w:b/>
-          <w:color w:val="000000"/>
-          <w:sz w:val="18"/>
-          <w:szCs w:val="22"/>
-          <w:lang w:eastAsia="ar-SA"/>
-        </w:rPr>
-        <w:t>Red Hat, Inc.,</w:t>
-      </w:r>
-      <w:r>
-        <w:rPr>
-          <w:rFonts w:ascii="Arial" w:hAnsi="Arial"/>
-          <w:b/>
-          <w:color w:val="000000"/>
-          <w:sz w:val="18"/>
-          <w:szCs w:val="22"/>
+          <w:bCs/>
+          <w:color w:val="000000"/>
+          <w:sz w:val="18"/>
+          <w:szCs w:val="22"/>
+          <w:lang w:eastAsia="ar-SA"/>
+        </w:rPr>
+        <w:t>Mountain View, California</w:t>
+      </w:r>
+      <w:r>
+        <w:rPr>
+          <w:rFonts w:ascii="Arial" w:hAnsi="Arial"/>
+          <w:bCs/>
+          <w:color w:val="000000"/>
+          <w:sz w:val="18"/>
+          <w:szCs w:val="22"/>
+          <w:lang w:eastAsia="ar-SA"/>
+        </w:rPr>
+        <w:t>.</w:t>
+      </w:r>
+    </w:p>
+    <w:p>
+      <w:pPr>
+        <w:tabs>
+          <w:tab w:val="left" w:pos="-720"/>
+        </w:tabs>
+        <w:ind w:right="-720"/>
+        <w:rPr>
+          <w:rFonts w:ascii="Arial" w:hAnsi="Arial"/>
+          <w:color w:val="000000"/>
+          <w:sz w:val="18"/>
+          <w:szCs w:val="22"/>
+          <w:lang w:eastAsia="ar-SA"/>
+        </w:rPr>
+      </w:pPr>
+      <w:r>
+        <w:rPr>
+          <w:rFonts w:ascii="Arial" w:hAnsi="Arial"/>
+          <w:b/>
+          <w:color w:val="000000"/>
+          <w:sz w:val="18"/>
+          <w:szCs w:val="22"/>
+          <w:lang w:eastAsia="ar-SA"/>
+        </w:rPr>
+        <w:t>Member of Technical Staff</w:t>
+      </w:r>
+      <w:r>
+        <w:rPr>
+          <w:rFonts w:ascii="Arial" w:hAnsi="Arial"/>
+          <w:color w:val="000000"/>
+          <w:sz w:val="18"/>
+          <w:szCs w:val="22"/>
+          <w:lang w:eastAsia="ar-SA"/>
+        </w:rPr>
+        <w:t>, March 1996 to November 1997</w:t>
+      </w:r>
+    </w:p>
+    <w:p>
+      <w:pPr>
+        <w:tabs>
+          <w:tab w:val="left" w:pos="-720"/>
+        </w:tabs>
+        <w:ind w:right="-720"/>
+        <w:rPr>
+          <w:rFonts w:ascii="Arial" w:hAnsi="Arial"/>
+          <w:color w:val="000000"/>
+          <w:sz w:val="18"/>
+          <w:szCs w:val="22"/>
+          <w:lang w:eastAsia="ar-SA"/>
+        </w:rPr>
+      </w:pPr>
+    </w:p>
+    <w:p>
+      <w:pPr>
+        <w:tabs>
+          <w:tab w:val="left" w:pos="-720"/>
+        </w:tabs>
+        <w:ind w:right="-720"/>
+        <w:rPr>
+          <w:rFonts w:ascii="Arial" w:hAnsi="Arial"/>
+          <w:b/>
+          <w:color w:val="000000"/>
+          <w:sz w:val="18"/>
+          <w:szCs w:val="22"/>
+          <w:lang w:eastAsia="ar-SA"/>
+        </w:rPr>
+      </w:pPr>
+      <w:r>
+        <w:rPr>
+          <w:rFonts w:ascii="Arial" w:hAnsi="Arial"/>
+          <w:b/>
+          <w:color w:val="000000"/>
+          <w:sz w:val="18"/>
+          <w:szCs w:val="22"/>
+          <w:lang w:eastAsia="ar-SA"/>
+        </w:rPr>
+        <w:t xml:space="preserve">Claris Corporation (now </w:t>
+      </w:r>
+      <w:r>
+        <w:rPr>
+          <w:rFonts w:ascii="Arial" w:hAnsi="Arial"/>
+          <w:b/>
+          <w:color w:val="000000"/>
+          <w:sz w:val="18"/>
+          <w:szCs w:val="22"/>
+          <w:lang w:eastAsia="ar-SA"/>
+        </w:rPr>
+        <w:t>Claris International</w:t>
+      </w:r>
+      <w:r>
+        <w:rPr>
+          <w:rFonts w:ascii="Arial" w:hAnsi="Arial"/>
+          <w:b/>
+          <w:color w:val="000000"/>
+          <w:sz w:val="18"/>
+          <w:szCs w:val="22"/>
+          <w:lang w:eastAsia="ar-SA"/>
+        </w:rPr>
+        <w:t xml:space="preserve">), </w:t>
+      </w:r>
+      <w:r>
+        <w:rPr>
+          <w:rFonts w:ascii="Arial" w:hAnsi="Arial"/>
+          <w:bCs/>
+          <w:color w:val="000000"/>
+          <w:sz w:val="18"/>
+          <w:szCs w:val="22"/>
+          <w:lang w:eastAsia="ar-SA"/>
+        </w:rPr>
+        <w:t>Santa Clara, California</w:t>
+      </w:r>
+      <w:r>
+        <w:rPr>
+          <w:rFonts w:ascii="Arial" w:hAnsi="Arial"/>
+          <w:bCs/>
+          <w:color w:val="000000"/>
+          <w:sz w:val="18"/>
+          <w:szCs w:val="22"/>
+          <w:lang w:eastAsia="ar-SA"/>
+        </w:rPr>
+        <w:t xml:space="preserve"> / </w:t>
+      </w:r>
+      <w:proofErr w:type="spellStart"/>
+      <w:r>
+        <w:rPr>
+          <w:rFonts w:ascii="Arial" w:hAnsi="Arial"/>
+          <w:b/>
+          <w:color w:val="000000"/>
+          <w:sz w:val="18"/>
+          <w:szCs w:val="22"/>
+          <w:lang w:eastAsia="ar-SA"/>
+        </w:rPr>
+        <w:t>StyleWare</w:t>
+      </w:r>
+      <w:proofErr w:type="spellEnd"/>
+      <w:r>
+        <w:rPr>
+          <w:rFonts w:ascii="Arial" w:hAnsi="Arial"/>
+          <w:b/>
+          <w:color w:val="000000"/>
+          <w:sz w:val="18"/>
+          <w:szCs w:val="22"/>
+          <w:lang w:eastAsia="ar-SA"/>
+        </w:rPr>
+        <w:t xml:space="preserve">, Inc., </w:t>
+      </w:r>
+      <w:r>
+        <w:rPr>
+          <w:rFonts w:ascii="Arial" w:hAnsi="Arial"/>
+          <w:bCs/>
+          <w:color w:val="000000"/>
+          <w:sz w:val="18"/>
+          <w:szCs w:val="22"/>
+          <w:lang w:eastAsia="ar-SA"/>
+        </w:rPr>
+        <w:t>Houston, Texas</w:t>
+      </w:r>
+    </w:p>
+    <w:p>
+      <w:pPr>
+        <w:tabs>
+          <w:tab w:val="left" w:pos="-720"/>
+        </w:tabs>
+        <w:ind w:right="-720"/>
+        <w:rPr>
+          <w:rFonts w:ascii="Arial" w:hAnsi="Arial"/>
+          <w:color w:val="000000"/>
+          <w:sz w:val="18"/>
+          <w:szCs w:val="22"/>
+          <w:lang w:eastAsia="ar-SA"/>
+        </w:rPr>
+      </w:pPr>
+      <w:r>
+        <w:rPr>
+          <w:rFonts w:ascii="Arial" w:hAnsi="Arial"/>
+          <w:b/>
+          <w:color w:val="000000"/>
+          <w:sz w:val="18"/>
+          <w:szCs w:val="22"/>
+          <w:lang w:eastAsia="ar-SA"/>
+        </w:rPr>
+        <w:t>Software Engineer</w:t>
+      </w:r>
+      <w:r>
+        <w:rPr>
+          <w:rFonts w:ascii="Arial" w:hAnsi="Arial"/>
+          <w:color w:val="000000"/>
+          <w:sz w:val="18"/>
+          <w:szCs w:val="22"/>
+          <w:lang w:eastAsia="ar-SA"/>
+        </w:rPr>
+        <w:t>, December 1987-March 1996</w:t>
+      </w:r>
+    </w:p>
+    <w:p>
+      <w:pPr>
+        <w:tabs>
+          <w:tab w:val="left" w:pos="-720"/>
+        </w:tabs>
+        <w:ind w:right="-720"/>
+        <w:rPr>
+          <w:rFonts w:ascii="Arial" w:hAnsi="Arial"/>
+          <w:color w:val="000000"/>
+          <w:sz w:val="18"/>
+          <w:szCs w:val="22"/>
+          <w:lang w:eastAsia="ar-SA"/>
+        </w:rPr>
+      </w:pPr>
+    </w:p>
+    <w:p>
+      <w:pPr>
+        <w:tabs>
+          <w:tab w:val="left" w:pos="-720"/>
+        </w:tabs>
+        <w:ind w:right="-720"/>
+        <w:rPr>
+          <w:rFonts w:ascii="Arial" w:hAnsi="Arial"/>
+          <w:b/>
+          <w:color w:val="000000"/>
+          <w:sz w:val="20"/>
+          <w:szCs w:val="22"/>
+          <w:lang w:eastAsia="ar-SA"/>
+        </w:rPr>
+      </w:pPr>
+      <w:r>
+        <w:rPr>
+          <w:rFonts w:ascii="Arial" w:hAnsi="Arial"/>
+          <w:b/>
+          <w:color w:val="000000"/>
+          <w:sz w:val="20"/>
+          <w:szCs w:val="22"/>
+          <w:lang w:eastAsia="ar-SA"/>
+        </w:rPr>
+        <w:t>SKILLS</w:t>
+      </w:r>
+    </w:p>
+    <w:p>
+      <w:pPr>
+        <w:tabs>
+          <w:tab w:val="left" w:pos="-720"/>
+        </w:tabs>
+        <w:ind w:right="-720"/>
+        <w:rPr>
+          <w:rFonts w:ascii="Arial" w:hAnsi="Arial"/>
+          <w:color w:val="000000"/>
+          <w:sz w:val="18"/>
+          <w:szCs w:val="22"/>
+          <w:lang w:eastAsia="ar-SA"/>
+        </w:rPr>
+      </w:pPr>
+    </w:p>
+    <w:p>
+      <w:pPr>
+        <w:tabs>
+          <w:tab w:val="left" w:pos="-720"/>
+        </w:tabs>
+        <w:ind w:right="-720"/>
+        <w:jc w:val="both"/>
+        <w:rPr>
+          <w:rFonts w:ascii="Arial" w:hAnsi="Arial"/>
+          <w:color w:val="000000"/>
+          <w:sz w:val="18"/>
+          <w:szCs w:val="18"/>
+          <w:lang w:eastAsia="ar-SA"/>
+        </w:rPr>
+      </w:pPr>
+      <w:r>
+        <w:rPr>
+          <w:rFonts w:ascii="Arial" w:hAnsi="Arial"/>
+          <w:color w:val="000000"/>
+          <w:sz w:val="18"/>
+          <w:szCs w:val="18"/>
+          <w:lang w:eastAsia="ar-SA"/>
+        </w:rPr>
+        <w:t xml:space="preserve">Swift, SwiftUI, </w:t>
+      </w:r>
+      <w:proofErr w:type="spellStart"/>
+      <w:r>
+        <w:rPr>
+          <w:rFonts w:ascii="Arial" w:hAnsi="Arial"/>
+          <w:color w:val="000000"/>
+          <w:sz w:val="18"/>
+          <w:szCs w:val="18"/>
+          <w:lang w:eastAsia="ar-SA"/>
+        </w:rPr>
+        <w:t>UIKit</w:t>
+      </w:r>
+      <w:proofErr w:type="spellEnd"/>
+      <w:r>
+        <w:rPr>
+          <w:rFonts w:ascii="Arial" w:hAnsi="Arial"/>
+          <w:color w:val="000000"/>
+          <w:sz w:val="18"/>
+          <w:szCs w:val="18"/>
+          <w:lang w:eastAsia="ar-SA"/>
+        </w:rPr>
+        <w:t xml:space="preserve">  Combine, </w:t>
+      </w:r>
+      <w:r>
+        <w:rPr>
+          <w:rFonts w:ascii="Arial" w:hAnsi="Arial"/>
+          <w:color w:val="000000"/>
+          <w:sz w:val="18"/>
+          <w:szCs w:val="18"/>
+          <w:lang w:eastAsia="ar-SA"/>
+        </w:rPr>
+        <w:t>Xcode</w:t>
+      </w:r>
+      <w:r>
+        <w:rPr>
+          <w:rFonts w:ascii="Arial" w:hAnsi="Arial"/>
+          <w:color w:val="000000"/>
+          <w:sz w:val="18"/>
+          <w:szCs w:val="18"/>
+          <w:lang w:eastAsia="ar-SA"/>
+        </w:rPr>
+        <w:t xml:space="preserve">, Bash/shell scripting, Java, </w:t>
+      </w:r>
+      <w:proofErr w:type="spellStart"/>
+      <w:r>
+        <w:rPr>
+          <w:rFonts w:ascii="Arial" w:hAnsi="Arial"/>
+          <w:color w:val="000000"/>
+          <w:sz w:val="18"/>
+          <w:szCs w:val="18"/>
+          <w:lang w:eastAsia="ar-SA"/>
+        </w:rPr>
+        <w:t>GraphQL</w:t>
+      </w:r>
+      <w:proofErr w:type="spellEnd"/>
+      <w:r>
+        <w:rPr>
+          <w:rFonts w:ascii="Arial" w:hAnsi="Arial"/>
+          <w:color w:val="000000"/>
+          <w:sz w:val="18"/>
+          <w:szCs w:val="18"/>
+          <w:lang w:eastAsia="ar-SA"/>
+        </w:rPr>
+        <w:t xml:space="preserve">, Apollo Federation, Python, Spring, Spring Boot, </w:t>
+      </w:r>
+      <w:r>
+        <w:rPr>
+          <w:rFonts w:ascii="Arial" w:hAnsi="Arial"/>
+          <w:color w:val="000000"/>
+          <w:sz w:val="18"/>
+          <w:szCs w:val="18"/>
+          <w:lang w:eastAsia="ar-SA"/>
+        </w:rPr>
+        <w:t xml:space="preserve">Objective C, </w:t>
+      </w:r>
+      <w:r>
+        <w:rPr>
+          <w:rFonts w:ascii="Arial" w:hAnsi="Arial"/>
+          <w:color w:val="000000"/>
+          <w:sz w:val="18"/>
+          <w:szCs w:val="18"/>
+          <w:lang w:eastAsia="ar-SA"/>
+        </w:rPr>
+        <w:t xml:space="preserve">RESTful APIs, </w:t>
+      </w:r>
+      <w:proofErr w:type="spellStart"/>
+      <w:r>
+        <w:rPr>
+          <w:rFonts w:ascii="Arial" w:hAnsi="Arial"/>
+          <w:color w:val="000000"/>
+          <w:sz w:val="18"/>
+          <w:szCs w:val="18"/>
+          <w:lang w:eastAsia="ar-SA"/>
+        </w:rPr>
+        <w:t>Javascript</w:t>
+      </w:r>
+      <w:proofErr w:type="spellEnd"/>
+      <w:r>
+        <w:rPr>
+          <w:rFonts w:ascii="Arial" w:hAnsi="Arial"/>
+          <w:color w:val="000000"/>
+          <w:sz w:val="18"/>
+          <w:szCs w:val="18"/>
+          <w:lang w:eastAsia="ar-SA"/>
+        </w:rPr>
+        <w:t xml:space="preserve">, Soy, HTML, CSS, Django, </w:t>
+      </w:r>
+      <w:r>
+        <w:rPr>
+          <w:rFonts w:ascii="Arial" w:hAnsi="Arial"/>
+          <w:color w:val="000000"/>
+          <w:sz w:val="18"/>
+          <w:szCs w:val="18"/>
+          <w:lang w:eastAsia="ar-SA"/>
+        </w:rPr>
+        <w:t xml:space="preserve">C, </w:t>
+      </w:r>
+      <w:r>
+        <w:rPr>
+          <w:rFonts w:ascii="Arial" w:hAnsi="Arial"/>
+          <w:color w:val="000000"/>
+          <w:sz w:val="18"/>
+          <w:szCs w:val="18"/>
+          <w:lang w:eastAsia="ar-SA"/>
+        </w:rPr>
+        <w:t>SQL,</w:t>
+      </w:r>
+      <w:r>
+        <w:rPr>
+          <w:rFonts w:ascii="Arial" w:hAnsi="Arial"/>
+          <w:color w:val="000000"/>
+          <w:sz w:val="18"/>
+          <w:szCs w:val="18"/>
+          <w:lang w:eastAsia="ar-SA"/>
+        </w:rPr>
+        <w:t xml:space="preserve"> Perl, </w:t>
+      </w:r>
+      <w:proofErr w:type="spellStart"/>
+      <w:r>
+        <w:rPr>
+          <w:rFonts w:ascii="Arial" w:hAnsi="Arial"/>
+          <w:color w:val="000000"/>
+          <w:sz w:val="18"/>
+          <w:szCs w:val="18"/>
+          <w:lang w:eastAsia="ar-SA"/>
+        </w:rPr>
+        <w:t>Tcl</w:t>
+      </w:r>
+      <w:proofErr w:type="spellEnd"/>
+      <w:r>
+        <w:rPr>
+          <w:rFonts w:ascii="Arial" w:hAnsi="Arial"/>
+          <w:color w:val="000000"/>
+          <w:sz w:val="18"/>
+          <w:szCs w:val="18"/>
+          <w:lang w:eastAsia="ar-SA"/>
+        </w:rPr>
+        <w:t xml:space="preserve">, Ruby, Eclipse, MacOS, iOS, Unix, Linux, Windows, Visual Studio, </w:t>
+      </w:r>
+      <w:proofErr w:type="spellStart"/>
+      <w:r>
+        <w:rPr>
+          <w:rFonts w:ascii="Arial" w:hAnsi="Arial"/>
+          <w:color w:val="000000"/>
+          <w:sz w:val="18"/>
+          <w:szCs w:val="18"/>
+          <w:lang w:eastAsia="ar-SA"/>
+        </w:rPr>
+        <w:t>cvs</w:t>
+      </w:r>
+      <w:proofErr w:type="spellEnd"/>
+      <w:r>
+        <w:rPr>
+          <w:rFonts w:ascii="Arial" w:hAnsi="Arial"/>
+          <w:color w:val="000000"/>
+          <w:sz w:val="18"/>
+          <w:szCs w:val="18"/>
+          <w:lang w:eastAsia="ar-SA"/>
+        </w:rPr>
+        <w:t xml:space="preserve">, Subversion, Perforce, git, </w:t>
+      </w:r>
+      <w:proofErr w:type="spellStart"/>
+      <w:r>
+        <w:rPr>
+          <w:rFonts w:ascii="Arial" w:hAnsi="Arial"/>
+          <w:color w:val="000000"/>
+          <w:sz w:val="18"/>
+          <w:szCs w:val="18"/>
+          <w:lang w:eastAsia="ar-SA"/>
+        </w:rPr>
+        <w:t>Bitkeeper</w:t>
+      </w:r>
+      <w:proofErr w:type="spellEnd"/>
+      <w:r>
+        <w:rPr>
+          <w:rFonts w:ascii="Arial" w:hAnsi="Arial"/>
+          <w:color w:val="000000"/>
+          <w:sz w:val="18"/>
+          <w:szCs w:val="18"/>
+          <w:lang w:eastAsia="ar-SA"/>
+        </w:rPr>
+        <w:t xml:space="preserve">, </w:t>
+      </w:r>
+      <w:r>
+        <w:rPr>
+          <w:rFonts w:ascii="Arial" w:hAnsi="Arial"/>
+          <w:color w:val="000000"/>
+          <w:sz w:val="18"/>
+          <w:szCs w:val="18"/>
+          <w:lang w:eastAsia="ar-SA"/>
+        </w:rPr>
+        <w:t xml:space="preserve">Mercurial, </w:t>
+      </w:r>
+      <w:proofErr w:type="spellStart"/>
+      <w:r>
+        <w:rPr>
+          <w:rFonts w:ascii="Arial" w:hAnsi="Arial"/>
+          <w:color w:val="000000"/>
+          <w:sz w:val="18"/>
+          <w:szCs w:val="18"/>
+          <w:lang w:eastAsia="ar-SA"/>
+        </w:rPr>
+        <w:t>gcc</w:t>
+      </w:r>
+      <w:proofErr w:type="spellEnd"/>
+      <w:r>
+        <w:rPr>
+          <w:rFonts w:ascii="Arial" w:hAnsi="Arial"/>
+          <w:color w:val="000000"/>
+          <w:sz w:val="18"/>
+          <w:szCs w:val="18"/>
+          <w:lang w:eastAsia="ar-SA"/>
+        </w:rPr>
+        <w:t>, Jenkins, VMWare, Cocoa, Bugzilla, JIRA,</w:t>
+      </w:r>
+      <w:r>
+        <w:rPr>
+          <w:rFonts w:ascii="Arial" w:hAnsi="Arial"/>
+          <w:color w:val="000000"/>
+          <w:sz w:val="18"/>
+          <w:szCs w:val="18"/>
           <w:lang w:eastAsia="ar-SA"/>
         </w:rPr>
         <w:t xml:space="preserve"> </w:t>
       </w:r>
-      <w:r>
-        <w:rPr>
-          <w:rFonts w:ascii="Arial" w:hAnsi="Arial"/>
-          <w:b/>
-          <w:color w:val="000000"/>
-          <w:sz w:val="18"/>
-          <w:szCs w:val="22"/>
-          <w:lang w:eastAsia="ar-SA"/>
-        </w:rPr>
-        <w:t>San Francisco</w:t>
-      </w:r>
-      <w:r>
-        <w:rPr>
-          <w:rFonts w:ascii="Arial" w:hAnsi="Arial"/>
-          <w:b/>
-          <w:color w:val="000000"/>
-          <w:sz w:val="18"/>
-          <w:szCs w:val="22"/>
-          <w:lang w:eastAsia="ar-SA"/>
-        </w:rPr>
-        <w:t>, California</w:t>
-      </w:r>
-    </w:p>
-    <w:p>
-      <w:pPr>
-        <w:tabs>
-          <w:tab w:val="left" w:pos="-720"/>
-        </w:tabs>
-        <w:ind w:right="-720"/>
-        <w:rPr>
-          <w:rFonts w:ascii="Arial" w:hAnsi="Arial"/>
-          <w:b/>
-          <w:color w:val="000000"/>
-          <w:sz w:val="18"/>
-          <w:szCs w:val="22"/>
-          <w:lang w:eastAsia="ar-SA"/>
-        </w:rPr>
-      </w:pPr>
-      <w:r>
-        <w:rPr>
-          <w:rFonts w:ascii="Arial" w:hAnsi="Arial"/>
-          <w:b/>
-          <w:color w:val="000000"/>
-          <w:sz w:val="18"/>
-          <w:szCs w:val="22"/>
-          <w:lang w:eastAsia="ar-SA"/>
-        </w:rPr>
-        <w:t>Cygnus Solutions, Sunnyvale, California</w:t>
-      </w:r>
-    </w:p>
-    <w:p>
-      <w:pPr>
-        <w:tabs>
-          <w:tab w:val="left" w:pos="-720"/>
-        </w:tabs>
-        <w:ind w:right="-720"/>
-        <w:rPr>
-          <w:rFonts w:ascii="Arial" w:hAnsi="Arial"/>
-          <w:color w:val="000000"/>
-          <w:sz w:val="18"/>
-          <w:szCs w:val="22"/>
-          <w:lang w:eastAsia="ar-SA"/>
-        </w:rPr>
-      </w:pPr>
-      <w:r>
-        <w:rPr>
-          <w:rFonts w:ascii="Arial" w:hAnsi="Arial"/>
-          <w:b/>
-          <w:color w:val="000000"/>
-          <w:sz w:val="18"/>
-          <w:szCs w:val="22"/>
-          <w:lang w:eastAsia="ar-SA"/>
-        </w:rPr>
-        <w:t>Engineering Manager</w:t>
-      </w:r>
-      <w:r>
-        <w:rPr>
-          <w:rFonts w:ascii="Arial" w:hAnsi="Arial"/>
-          <w:color w:val="000000"/>
-          <w:sz w:val="18"/>
-          <w:szCs w:val="22"/>
-          <w:lang w:eastAsia="ar-SA"/>
-        </w:rPr>
-        <w:t>, November 1997-</w:t>
-      </w:r>
-      <w:r>
-        <w:rPr>
-          <w:rFonts w:ascii="Arial" w:hAnsi="Arial"/>
-          <w:color w:val="000000"/>
-          <w:sz w:val="18"/>
-          <w:szCs w:val="22"/>
-          <w:lang w:eastAsia="ar-SA"/>
-        </w:rPr>
-        <w:t>May</w:t>
-      </w:r>
-      <w:r>
-        <w:rPr>
-          <w:rFonts w:ascii="Arial" w:hAnsi="Arial"/>
-          <w:color w:val="000000"/>
-          <w:sz w:val="18"/>
-          <w:szCs w:val="22"/>
-          <w:lang w:eastAsia="ar-SA"/>
-        </w:rPr>
-        <w:t xml:space="preserve"> 2001</w:t>
-      </w:r>
-    </w:p>
-    <w:p>
-      <w:pPr>
-        <w:tabs>
-          <w:tab w:val="left" w:pos="-720"/>
-        </w:tabs>
-        <w:ind w:right="-720"/>
-        <w:rPr>
-          <w:rFonts w:ascii="Arial" w:hAnsi="Arial"/>
-          <w:b/>
-          <w:color w:val="000000"/>
-          <w:sz w:val="18"/>
-          <w:szCs w:val="22"/>
-          <w:lang w:eastAsia="ar-SA"/>
-        </w:rPr>
-      </w:pPr>
-    </w:p>
-    <w:p>
-      <w:pPr>
-        <w:tabs>
-          <w:tab w:val="left" w:pos="-720"/>
-        </w:tabs>
-        <w:ind w:right="-720"/>
-        <w:rPr>
-          <w:rFonts w:ascii="Arial" w:hAnsi="Arial"/>
-          <w:b/>
-          <w:color w:val="000000"/>
-          <w:sz w:val="18"/>
-          <w:szCs w:val="22"/>
-          <w:lang w:eastAsia="ar-SA"/>
-        </w:rPr>
-      </w:pPr>
-      <w:r>
-        <w:rPr>
-          <w:rFonts w:ascii="Arial" w:hAnsi="Arial"/>
-          <w:b/>
-          <w:color w:val="000000"/>
-          <w:sz w:val="18"/>
-          <w:szCs w:val="22"/>
-          <w:lang w:eastAsia="ar-SA"/>
-        </w:rPr>
-        <w:t>Sun Microsystems Laboratories, Mountain View, California</w:t>
-      </w:r>
-    </w:p>
-    <w:p>
-      <w:pPr>
-        <w:tabs>
-          <w:tab w:val="left" w:pos="-720"/>
-        </w:tabs>
-        <w:ind w:right="-720"/>
-        <w:rPr>
-          <w:rFonts w:ascii="Arial" w:hAnsi="Arial"/>
-          <w:color w:val="000000"/>
-          <w:sz w:val="18"/>
-          <w:szCs w:val="22"/>
-          <w:lang w:eastAsia="ar-SA"/>
-        </w:rPr>
-      </w:pPr>
-      <w:r>
-        <w:rPr>
-          <w:rFonts w:ascii="Arial" w:hAnsi="Arial"/>
-          <w:b/>
-          <w:color w:val="000000"/>
-          <w:sz w:val="18"/>
-          <w:szCs w:val="22"/>
-          <w:lang w:eastAsia="ar-SA"/>
-        </w:rPr>
-        <w:t>Member of Technical Staff</w:t>
-      </w:r>
-      <w:r>
-        <w:rPr>
-          <w:rFonts w:ascii="Arial" w:hAnsi="Arial"/>
-          <w:color w:val="000000"/>
-          <w:sz w:val="18"/>
-          <w:szCs w:val="22"/>
-          <w:lang w:eastAsia="ar-SA"/>
-        </w:rPr>
-        <w:t>, March 1996 to November 1997</w:t>
-      </w:r>
-    </w:p>
-    <w:p>
-      <w:pPr>
-        <w:tabs>
-          <w:tab w:val="left" w:pos="-720"/>
-        </w:tabs>
-        <w:ind w:right="-720"/>
-        <w:rPr>
-          <w:rFonts w:ascii="Arial" w:hAnsi="Arial"/>
-          <w:color w:val="000000"/>
-          <w:sz w:val="18"/>
-          <w:szCs w:val="22"/>
-          <w:lang w:eastAsia="ar-SA"/>
-        </w:rPr>
-      </w:pPr>
-      <w:r>
-        <w:rPr>
-          <w:rFonts w:ascii="Arial" w:hAnsi="Arial"/>
-          <w:color w:val="000000"/>
-          <w:sz w:val="18"/>
-          <w:szCs w:val="22"/>
-          <w:lang w:eastAsia="ar-SA"/>
-        </w:rPr>
-        <w:tab/>
-      </w:r>
-    </w:p>
-    <w:p>
-      <w:pPr>
-        <w:tabs>
-          <w:tab w:val="left" w:pos="-720"/>
-        </w:tabs>
-        <w:ind w:right="-720"/>
-        <w:rPr>
-          <w:rFonts w:ascii="Arial" w:hAnsi="Arial"/>
-          <w:b/>
-          <w:color w:val="000000"/>
-          <w:sz w:val="18"/>
-          <w:szCs w:val="22"/>
-          <w:lang w:eastAsia="ar-SA"/>
-        </w:rPr>
-      </w:pPr>
-      <w:r>
-        <w:rPr>
-          <w:rFonts w:ascii="Arial" w:hAnsi="Arial"/>
-          <w:b/>
-          <w:color w:val="000000"/>
-          <w:sz w:val="18"/>
-          <w:szCs w:val="22"/>
-          <w:lang w:eastAsia="ar-SA"/>
-        </w:rPr>
-        <w:t xml:space="preserve">Claris Corporation (now </w:t>
-      </w:r>
-      <w:r>
-        <w:rPr>
-          <w:rFonts w:ascii="Arial" w:hAnsi="Arial"/>
-          <w:b/>
-          <w:color w:val="000000"/>
-          <w:sz w:val="18"/>
-          <w:szCs w:val="22"/>
-          <w:lang w:eastAsia="ar-SA"/>
-        </w:rPr>
-        <w:t>Claris International, Inc</w:t>
-      </w:r>
-      <w:r>
-        <w:rPr>
-          <w:rFonts w:ascii="Arial" w:hAnsi="Arial"/>
-          <w:b/>
-          <w:color w:val="000000"/>
-          <w:sz w:val="18"/>
-          <w:szCs w:val="22"/>
-          <w:lang w:eastAsia="ar-SA"/>
-        </w:rPr>
-        <w:t>.)</w:t>
-      </w:r>
-      <w:r>
-        <w:rPr>
-          <w:rFonts w:ascii="Arial" w:hAnsi="Arial"/>
-          <w:b/>
-          <w:color w:val="000000"/>
-          <w:sz w:val="18"/>
-          <w:szCs w:val="22"/>
-          <w:lang w:eastAsia="ar-SA"/>
-        </w:rPr>
-        <w:t>,</w:t>
-      </w:r>
-      <w:r>
-        <w:rPr>
-          <w:rFonts w:ascii="Arial" w:hAnsi="Arial"/>
-          <w:b/>
-          <w:color w:val="000000"/>
-          <w:sz w:val="18"/>
-          <w:szCs w:val="22"/>
-          <w:lang w:eastAsia="ar-SA"/>
-        </w:rPr>
-        <w:t xml:space="preserve"> Santa Clara, California</w:t>
-      </w:r>
-    </w:p>
-    <w:p>
-      <w:pPr>
-        <w:tabs>
-          <w:tab w:val="left" w:pos="-720"/>
-        </w:tabs>
-        <w:ind w:right="-720"/>
-        <w:rPr>
-          <w:rFonts w:ascii="Arial" w:hAnsi="Arial"/>
-          <w:b/>
-          <w:color w:val="000000"/>
-          <w:sz w:val="18"/>
-          <w:szCs w:val="22"/>
-          <w:lang w:eastAsia="ar-SA"/>
-        </w:rPr>
-      </w:pPr>
-      <w:r>
-        <w:rPr>
-          <w:rFonts w:ascii="Arial" w:hAnsi="Arial"/>
-          <w:b/>
-          <w:color w:val="000000"/>
-          <w:sz w:val="18"/>
-          <w:szCs w:val="22"/>
-          <w:lang w:eastAsia="ar-SA"/>
-        </w:rPr>
-        <w:t>StyleWare, Inc., Houston, Texas</w:t>
-      </w:r>
-    </w:p>
-    <w:p>
-      <w:pPr>
-        <w:tabs>
-          <w:tab w:val="left" w:pos="-720"/>
-        </w:tabs>
-        <w:ind w:right="-720"/>
-        <w:rPr>
-          <w:rFonts w:ascii="Arial" w:hAnsi="Arial"/>
-          <w:color w:val="000000"/>
-          <w:sz w:val="18"/>
-          <w:szCs w:val="22"/>
-          <w:lang w:eastAsia="ar-SA"/>
-        </w:rPr>
-      </w:pPr>
-      <w:r>
-        <w:rPr>
-          <w:rFonts w:ascii="Arial" w:hAnsi="Arial"/>
-          <w:b/>
-          <w:color w:val="000000"/>
-          <w:sz w:val="18"/>
-          <w:szCs w:val="22"/>
-          <w:lang w:eastAsia="ar-SA"/>
-        </w:rPr>
-        <w:t>Software Engineer</w:t>
-      </w:r>
-      <w:r>
-        <w:rPr>
-          <w:rFonts w:ascii="Arial" w:hAnsi="Arial"/>
-          <w:color w:val="000000"/>
-          <w:sz w:val="18"/>
-          <w:szCs w:val="22"/>
-          <w:lang w:eastAsia="ar-SA"/>
-        </w:rPr>
-        <w:t xml:space="preserve">, </w:t>
-      </w:r>
-      <w:r>
-        <w:rPr>
-          <w:rFonts w:ascii="Arial" w:hAnsi="Arial"/>
-          <w:color w:val="000000"/>
-          <w:sz w:val="18"/>
-          <w:szCs w:val="22"/>
-          <w:lang w:eastAsia="ar-SA"/>
-        </w:rPr>
-        <w:t>May</w:t>
-      </w:r>
-      <w:r>
-        <w:rPr>
-          <w:rFonts w:ascii="Arial" w:hAnsi="Arial"/>
-          <w:color w:val="000000"/>
-          <w:sz w:val="18"/>
-          <w:szCs w:val="22"/>
-          <w:lang w:eastAsia="ar-SA"/>
-        </w:rPr>
-        <w:t xml:space="preserve"> 1987</w:t>
-      </w:r>
-      <w:r>
-        <w:rPr>
-          <w:rFonts w:ascii="Arial" w:hAnsi="Arial"/>
-          <w:color w:val="000000"/>
-          <w:sz w:val="18"/>
-          <w:szCs w:val="22"/>
-          <w:lang w:eastAsia="ar-SA"/>
-        </w:rPr>
-        <w:t>-March 1996</w:t>
-      </w:r>
-    </w:p>
-    <w:p>
-      <w:pPr>
-        <w:tabs>
-          <w:tab w:val="left" w:pos="-720"/>
-        </w:tabs>
-        <w:ind w:right="-720"/>
-        <w:rPr>
-          <w:rFonts w:ascii="Arial" w:hAnsi="Arial"/>
-          <w:color w:val="000000"/>
-          <w:sz w:val="18"/>
-          <w:szCs w:val="22"/>
-          <w:lang w:eastAsia="ar-SA"/>
-        </w:rPr>
-      </w:pPr>
-    </w:p>
-    <w:p>
-      <w:pPr>
-        <w:tabs>
-          <w:tab w:val="left" w:pos="-720"/>
-        </w:tabs>
-        <w:ind w:right="-720"/>
-        <w:rPr>
-          <w:rFonts w:ascii="Arial" w:hAnsi="Arial"/>
-          <w:b/>
-          <w:color w:val="000000"/>
-          <w:sz w:val="20"/>
-          <w:szCs w:val="22"/>
-          <w:lang w:eastAsia="ar-SA"/>
-        </w:rPr>
-      </w:pPr>
-      <w:r>
-        <w:rPr>
-          <w:rFonts w:ascii="Arial" w:hAnsi="Arial"/>
-          <w:b/>
-          <w:color w:val="000000"/>
-          <w:sz w:val="20"/>
-          <w:szCs w:val="22"/>
-          <w:lang w:eastAsia="ar-SA"/>
-        </w:rPr>
-        <w:t>SKILLS</w:t>
-      </w:r>
-    </w:p>
-    <w:p>
-      <w:pPr>
-        <w:tabs>
-          <w:tab w:val="left" w:pos="-720"/>
-        </w:tabs>
-        <w:ind w:right="-720"/>
-        <w:rPr>
-          <w:rFonts w:ascii="Arial" w:hAnsi="Arial"/>
-          <w:color w:val="000000"/>
-          <w:sz w:val="18"/>
-          <w:szCs w:val="22"/>
-          <w:lang w:eastAsia="ar-SA"/>
-        </w:rPr>
-      </w:pPr>
-    </w:p>
-    <w:p>
-      <w:pPr>
-        <w:tabs>
-          <w:tab w:val="left" w:pos="-720"/>
-        </w:tabs>
-        <w:ind w:right="-720"/>
+      <w:proofErr w:type="spellStart"/>
+      <w:r>
         <w:rPr>
           <w:rFonts w:ascii="Arial" w:hAnsi="Arial"/>
           <w:color w:val="000000"/>
@@ -3285,7 +3667,9 @@
           <w:szCs w:val="18"/>
           <w:lang w:eastAsia="ar-SA"/>
         </w:rPr>
-      </w:pPr>
+        <w:t>yocto</w:t>
+      </w:r>
+      <w:proofErr w:type="spellEnd"/>
       <w:r>
         <w:rPr>
           <w:rFonts w:ascii="Arial" w:hAnsi="Arial"/>
@@ -3294,7 +3678,7 @@
           <w:szCs w:val="18"/>
           <w:lang w:eastAsia="ar-SA"/>
         </w:rPr>
-        <w:t>Swift</w:t>
+        <w:t>, repo, vagrant, VirtualBox</w:t>
       </w:r>
       <w:r>
         <w:rPr>
@@ -3304,9 +3688,15 @@
           <w:szCs w:val="18"/>
           <w:lang w:eastAsia="ar-SA"/>
         </w:rPr>
-        <w:t xml:space="preserve"> </w:t>
-      </w:r>
-      <w:r>
+        <w:t>, Marionette, hobo, Datadog, Terraform, Kubernetes, Avro, Kafka, Docker, make, Subversion, Pascal, Assembly Language</w:t>
+      </w:r>
+    </w:p>
+    <w:p>
+      <w:pPr>
+        <w:tabs>
+          <w:tab w:val="left" w:pos="-720"/>
+        </w:tabs>
+        <w:ind w:right="-720"/>
         <w:rPr>
           <w:rFonts w:ascii="Arial" w:hAnsi="Arial"/>
           <w:color w:val="000000"/>
@@ -3314,10 +3704,14 @@
           <w:szCs w:val="18"/>
           <w:lang w:eastAsia="ar-SA"/>
         </w:rPr>
-        <w:t xml:space="preserve">, </w:t>
-      </w:r>
-      <w:proofErr w:type="spellStart"/>
-      <w:r>
+      </w:pPr>
+    </w:p>
+    <w:p>
+      <w:pPr>
+        <w:tabs>
+          <w:tab w:val="left" w:pos="-720"/>
+        </w:tabs>
+        <w:ind w:right="-720"/>
         <w:rPr>
           <w:rFonts w:ascii="Arial" w:hAnsi="Arial"/>
           <w:color w:val="000000"/>
@@ -3325,20 +3719,26 @@
           <w:szCs w:val="18"/>
           <w:lang w:eastAsia="ar-SA"/>
         </w:rPr>
-        <w:t>SwiftUI</w:t>
-      </w:r>
-      <w:proofErr w:type="spellEnd"/>
-      <w:r>
-        <w:rPr>
-          <w:rFonts w:ascii="Arial" w:hAnsi="Arial"/>
+      </w:pPr>
+      <w:r>
+        <w:rPr>
+          <w:rFonts w:ascii="Arial" w:hAnsi="Arial"/>
+          <w:b/>
+          <w:bCs/>
           <w:color w:val="000000"/>
           <w:sz w:val="18"/>
           <w:szCs w:val="18"/>
           <w:lang w:eastAsia="ar-SA"/>
         </w:rPr>
-        <w:t xml:space="preserve">, </w:t>
-      </w:r>
-      <w:r>
+        <w:t>ONLINE PUBLICATIONS</w:t>
+      </w:r>
+    </w:p>
+    <w:p>
+      <w:pPr>
+        <w:tabs>
+          <w:tab w:val="left" w:pos="-720"/>
+        </w:tabs>
+        <w:ind w:right="-720"/>
         <w:rPr>
           <w:rFonts w:ascii="Arial" w:hAnsi="Arial"/>
           <w:color w:val="000000"/>
@@ -3346,9 +3746,14 @@
           <w:szCs w:val="18"/>
           <w:lang w:eastAsia="ar-SA"/>
         </w:rPr>
-        <w:t>Java</w:t>
-      </w:r>
-      <w:r>
+      </w:pPr>
+    </w:p>
+    <w:p>
+      <w:pPr>
+        <w:tabs>
+          <w:tab w:val="left" w:pos="-720"/>
+        </w:tabs>
+        <w:ind w:right="-720"/>
         <w:rPr>
           <w:rFonts w:ascii="Arial" w:hAnsi="Arial"/>
           <w:color w:val="000000"/>
@@ -3356,8 +3761,19 @@
           <w:szCs w:val="18"/>
           <w:lang w:eastAsia="ar-SA"/>
         </w:rPr>
-        <w:t>, Python, Spring</w:t>
-      </w:r>
+      </w:pPr>
+      <w:hyperlink r:id="rId7" w:history="1">
+        <w:r>
+          <w:rPr>
+            <w:rStyle w:val="Hyperlink"/>
+            <w:rFonts w:ascii="Arial" w:hAnsi="Arial"/>
+            <w:sz w:val="18"/>
+            <w:szCs w:val="18"/>
+            <w:lang w:eastAsia="ar-SA"/>
+          </w:rPr>
+          <w:t>Recruited By Tech</w:t>
+        </w:r>
+      </w:hyperlink>
       <w:r>
         <w:rPr>
           <w:rFonts w:ascii="Arial" w:hAnsi="Arial"/>
@@ -3366,9 +3782,15 @@
           <w:szCs w:val="18"/>
           <w:lang w:eastAsia="ar-SA"/>
         </w:rPr>
-        <w:t>,</w:t>
-      </w:r>
-      <w:r>
+        <w:t xml:space="preserve"> – a blog about interviewing for jobs in the tech sector.</w:t>
+      </w:r>
+    </w:p>
+    <w:p>
+      <w:pPr>
+        <w:tabs>
+          <w:tab w:val="left" w:pos="-720"/>
+        </w:tabs>
+        <w:ind w:right="-720"/>
         <w:rPr>
           <w:rFonts w:ascii="Arial" w:hAnsi="Arial"/>
           <w:color w:val="000000"/>
@@ -3376,8 +3798,19 @@
           <w:szCs w:val="18"/>
           <w:lang w:eastAsia="ar-SA"/>
         </w:rPr>
-        <w:t xml:space="preserve"> </w:t>
-      </w:r>
+      </w:pPr>
+      <w:hyperlink r:id="rId8" w:history="1">
+        <w:r>
+          <w:rPr>
+            <w:rStyle w:val="Hyperlink"/>
+            <w:rFonts w:ascii="Arial" w:hAnsi="Arial"/>
+            <w:sz w:val="18"/>
+            <w:szCs w:val="18"/>
+            <w:lang w:eastAsia="ar-SA"/>
+          </w:rPr>
+          <w:t>Middle-class Tech</w:t>
+        </w:r>
+      </w:hyperlink>
       <w:r>
         <w:rPr>
           <w:rFonts w:ascii="Arial" w:hAnsi="Arial"/>
@@ -3386,9 +3819,16 @@
           <w:szCs w:val="18"/>
           <w:lang w:eastAsia="ar-SA"/>
         </w:rPr>
-        <w:t xml:space="preserve">Spring Boot, </w:t>
-      </w:r>
-      <w:r>
+        <w:t xml:space="preserve"> – a newsletter about my life in the tech sector.</w:t>
+      </w:r>
+    </w:p>
+    <w:bookmarkStart w:id="13" w:name="_Hlk204378807"/>
+    <w:p>
+      <w:pPr>
+        <w:tabs>
+          <w:tab w:val="left" w:pos="-720"/>
+        </w:tabs>
+        <w:ind w:right="-720"/>
         <w:rPr>
           <w:rFonts w:ascii="Arial" w:hAnsi="Arial"/>
           <w:color w:val="000000"/>
@@ -3396,17 +3836,28 @@
           <w:szCs w:val="18"/>
           <w:lang w:eastAsia="ar-SA"/>
         </w:rPr>
-        <w:t xml:space="preserve">Graph QL, </w:t>
-      </w:r>
-      <w:r>
-        <w:rPr>
-          <w:rFonts w:ascii="Arial" w:hAnsi="Arial"/>
-          <w:color w:val="000000"/>
+      </w:pPr>
+      <w:r>
+        <w:fldChar w:fldCharType="begin"/>
+      </w:r>
+      <w:r>
+        <w:instrText>HYPERLINK "https://sydneyrandall.blogspot.com/"</w:instrText>
+      </w:r>
+      <w:r>
+        <w:fldChar w:fldCharType="separate"/>
+      </w:r>
+      <w:r>
+        <w:rPr>
+          <w:rStyle w:val="Hyperlink"/>
+          <w:rFonts w:ascii="Arial" w:hAnsi="Arial"/>
           <w:sz w:val="18"/>
           <w:szCs w:val="18"/>
           <w:lang w:eastAsia="ar-SA"/>
         </w:rPr>
-        <w:t xml:space="preserve">Apollo Federation, Kubernetes, </w:t>
+        <w:t>Not Your Ordinary Computer Geek</w:t>
+      </w:r>
+      <w:r>
+        <w:fldChar w:fldCharType="end"/>
       </w:r>
       <w:r>
         <w:rPr>
@@ -3416,419 +3867,10 @@
           <w:szCs w:val="18"/>
           <w:lang w:eastAsia="ar-SA"/>
         </w:rPr>
-        <w:t xml:space="preserve">Docker, Datadog, Datadog APM, Terraform, </w:t>
-      </w:r>
-      <w:r>
-        <w:rPr>
-          <w:rFonts w:ascii="Arial" w:hAnsi="Arial"/>
-          <w:color w:val="000000"/>
-          <w:sz w:val="18"/>
-          <w:szCs w:val="18"/>
-          <w:lang w:eastAsia="ar-SA"/>
-        </w:rPr>
-        <w:t>REST</w:t>
-      </w:r>
-      <w:r>
-        <w:rPr>
-          <w:rFonts w:ascii="Arial" w:hAnsi="Arial"/>
-          <w:color w:val="000000"/>
-          <w:sz w:val="18"/>
-          <w:szCs w:val="18"/>
-          <w:lang w:eastAsia="ar-SA"/>
-        </w:rPr>
-        <w:t>ful APIs</w:t>
-      </w:r>
-      <w:r>
-        <w:rPr>
-          <w:rFonts w:ascii="Arial" w:hAnsi="Arial"/>
-          <w:color w:val="000000"/>
-          <w:sz w:val="18"/>
-          <w:szCs w:val="18"/>
-          <w:lang w:eastAsia="ar-SA"/>
-        </w:rPr>
-        <w:t>,</w:t>
-      </w:r>
-      <w:r>
-        <w:rPr>
-          <w:rFonts w:ascii="Arial" w:hAnsi="Arial"/>
-          <w:color w:val="000000"/>
-          <w:sz w:val="18"/>
-          <w:szCs w:val="18"/>
-          <w:lang w:eastAsia="ar-SA"/>
-        </w:rPr>
-        <w:t xml:space="preserve"> </w:t>
-      </w:r>
-      <w:r>
-        <w:rPr>
-          <w:rFonts w:ascii="Arial" w:hAnsi="Arial"/>
-          <w:color w:val="000000"/>
-          <w:sz w:val="18"/>
-          <w:szCs w:val="18"/>
-          <w:lang w:eastAsia="ar-SA"/>
-        </w:rPr>
-        <w:t xml:space="preserve">Objective C, </w:t>
-      </w:r>
-      <w:proofErr w:type="spellStart"/>
-      <w:r>
-        <w:rPr>
-          <w:rFonts w:ascii="Arial" w:hAnsi="Arial"/>
-          <w:color w:val="000000"/>
-          <w:sz w:val="18"/>
-          <w:szCs w:val="18"/>
-          <w:lang w:eastAsia="ar-SA"/>
-        </w:rPr>
-        <w:t>Javascript</w:t>
-      </w:r>
-      <w:proofErr w:type="spellEnd"/>
-      <w:r>
-        <w:rPr>
-          <w:rFonts w:ascii="Arial" w:hAnsi="Arial"/>
-          <w:color w:val="000000"/>
-          <w:sz w:val="18"/>
-          <w:szCs w:val="18"/>
-          <w:lang w:eastAsia="ar-SA"/>
-        </w:rPr>
-        <w:t xml:space="preserve">, </w:t>
-      </w:r>
-      <w:r>
-        <w:rPr>
-          <w:rFonts w:ascii="Arial" w:hAnsi="Arial"/>
-          <w:color w:val="000000"/>
-          <w:sz w:val="18"/>
-          <w:szCs w:val="18"/>
-          <w:lang w:eastAsia="ar-SA"/>
-        </w:rPr>
-        <w:t xml:space="preserve">HTML, CSS, Django, </w:t>
-      </w:r>
-      <w:r>
-        <w:rPr>
-          <w:rFonts w:ascii="Arial" w:hAnsi="Arial"/>
-          <w:color w:val="000000"/>
-          <w:sz w:val="18"/>
-          <w:szCs w:val="18"/>
-          <w:lang w:eastAsia="ar-SA"/>
-        </w:rPr>
-        <w:t xml:space="preserve">C, </w:t>
-      </w:r>
-      <w:r>
-        <w:rPr>
-          <w:rFonts w:ascii="Arial" w:hAnsi="Arial"/>
-          <w:color w:val="000000"/>
-          <w:sz w:val="18"/>
-          <w:szCs w:val="18"/>
-          <w:lang w:eastAsia="ar-SA"/>
-        </w:rPr>
-        <w:t>SQL,</w:t>
-      </w:r>
-      <w:r>
-        <w:rPr>
-          <w:rFonts w:ascii="Arial" w:hAnsi="Arial"/>
-          <w:color w:val="000000"/>
-          <w:sz w:val="18"/>
-          <w:szCs w:val="18"/>
-          <w:lang w:eastAsia="ar-SA"/>
-        </w:rPr>
-        <w:t xml:space="preserve"> </w:t>
-      </w:r>
-      <w:r>
-        <w:rPr>
-          <w:rFonts w:ascii="Arial" w:hAnsi="Arial"/>
-          <w:color w:val="000000"/>
-          <w:sz w:val="18"/>
-          <w:szCs w:val="18"/>
-          <w:lang w:eastAsia="ar-SA"/>
-        </w:rPr>
-        <w:t xml:space="preserve">Perl, Tcl, </w:t>
-      </w:r>
-      <w:r>
-        <w:rPr>
-          <w:rFonts w:ascii="Arial" w:hAnsi="Arial"/>
-          <w:color w:val="000000"/>
-          <w:sz w:val="18"/>
-          <w:szCs w:val="18"/>
-          <w:lang w:eastAsia="ar-SA"/>
-        </w:rPr>
-        <w:t xml:space="preserve">Ruby, </w:t>
-      </w:r>
-      <w:r>
-        <w:rPr>
-          <w:rFonts w:ascii="Arial" w:hAnsi="Arial"/>
-          <w:color w:val="000000"/>
-          <w:sz w:val="18"/>
-          <w:szCs w:val="18"/>
-          <w:lang w:eastAsia="ar-SA"/>
-        </w:rPr>
-        <w:t>C++, Xcode, Eclipse,</w:t>
-      </w:r>
-      <w:r>
-        <w:rPr>
-          <w:rFonts w:ascii="Arial" w:hAnsi="Arial"/>
-          <w:color w:val="000000"/>
-          <w:sz w:val="18"/>
-          <w:szCs w:val="18"/>
-          <w:lang w:eastAsia="ar-SA"/>
-        </w:rPr>
-        <w:t xml:space="preserve"> Mac OS X,</w:t>
-      </w:r>
-      <w:r>
-        <w:rPr>
-          <w:rFonts w:ascii="Arial" w:hAnsi="Arial"/>
-          <w:color w:val="000000"/>
-          <w:sz w:val="18"/>
-          <w:szCs w:val="18"/>
-          <w:lang w:eastAsia="ar-SA"/>
-        </w:rPr>
-        <w:t xml:space="preserve"> iOS, Unix, Linux, Windows, Visual Studio, </w:t>
-      </w:r>
-      <w:r>
-        <w:rPr>
-          <w:rFonts w:ascii="Arial" w:hAnsi="Arial"/>
-          <w:color w:val="000000"/>
-          <w:sz w:val="18"/>
-          <w:szCs w:val="18"/>
-          <w:lang w:eastAsia="ar-SA"/>
-        </w:rPr>
-        <w:t xml:space="preserve">IntelliJ, </w:t>
-      </w:r>
-      <w:proofErr w:type="spellStart"/>
-      <w:r>
-        <w:rPr>
-          <w:rFonts w:ascii="Arial" w:hAnsi="Arial"/>
-          <w:color w:val="000000"/>
-          <w:sz w:val="18"/>
-          <w:szCs w:val="18"/>
-          <w:lang w:eastAsia="ar-SA"/>
-        </w:rPr>
-        <w:t>Pycharm</w:t>
-      </w:r>
-      <w:proofErr w:type="spellEnd"/>
-      <w:r>
-        <w:rPr>
-          <w:rFonts w:ascii="Arial" w:hAnsi="Arial"/>
-          <w:color w:val="000000"/>
-          <w:sz w:val="18"/>
-          <w:szCs w:val="18"/>
-          <w:lang w:eastAsia="ar-SA"/>
-        </w:rPr>
-        <w:t xml:space="preserve">, </w:t>
-      </w:r>
-      <w:proofErr w:type="spellStart"/>
-      <w:r>
-        <w:rPr>
-          <w:rFonts w:ascii="Arial" w:hAnsi="Arial"/>
-          <w:color w:val="000000"/>
-          <w:sz w:val="18"/>
-          <w:szCs w:val="18"/>
-          <w:lang w:eastAsia="ar-SA"/>
-        </w:rPr>
-        <w:t>cvs</w:t>
-      </w:r>
-      <w:proofErr w:type="spellEnd"/>
-      <w:r>
-        <w:rPr>
-          <w:rFonts w:ascii="Arial" w:hAnsi="Arial"/>
-          <w:color w:val="000000"/>
-          <w:sz w:val="18"/>
-          <w:szCs w:val="18"/>
-          <w:lang w:eastAsia="ar-SA"/>
-        </w:rPr>
-        <w:t xml:space="preserve">, </w:t>
-      </w:r>
-      <w:r>
-        <w:rPr>
-          <w:rFonts w:ascii="Arial" w:hAnsi="Arial"/>
-          <w:color w:val="000000"/>
-          <w:sz w:val="18"/>
-          <w:szCs w:val="18"/>
-          <w:lang w:eastAsia="ar-SA"/>
-        </w:rPr>
-        <w:t>Subversion</w:t>
-      </w:r>
-      <w:r>
-        <w:rPr>
-          <w:rFonts w:ascii="Arial" w:hAnsi="Arial"/>
-          <w:color w:val="000000"/>
-          <w:sz w:val="18"/>
-          <w:szCs w:val="18"/>
-          <w:lang w:eastAsia="ar-SA"/>
-        </w:rPr>
-        <w:t xml:space="preserve">, Perforce, git, Bitkeeper, </w:t>
-      </w:r>
-      <w:r>
-        <w:rPr>
-          <w:rFonts w:ascii="Arial" w:hAnsi="Arial"/>
-          <w:color w:val="000000"/>
-          <w:sz w:val="18"/>
-          <w:szCs w:val="18"/>
-          <w:lang w:eastAsia="ar-SA"/>
-        </w:rPr>
-        <w:t xml:space="preserve">Mercurial, </w:t>
-      </w:r>
-      <w:r>
-        <w:rPr>
-          <w:rFonts w:ascii="Arial" w:hAnsi="Arial"/>
-          <w:color w:val="000000"/>
-          <w:sz w:val="18"/>
-          <w:szCs w:val="18"/>
-          <w:lang w:eastAsia="ar-SA"/>
-        </w:rPr>
-        <w:t xml:space="preserve">gcc, </w:t>
-      </w:r>
-      <w:r>
-        <w:rPr>
-          <w:rFonts w:ascii="Arial" w:hAnsi="Arial"/>
-          <w:color w:val="000000"/>
-          <w:sz w:val="18"/>
-          <w:szCs w:val="18"/>
-          <w:lang w:eastAsia="ar-SA"/>
-        </w:rPr>
-        <w:t>Jenkins</w:t>
-      </w:r>
-      <w:r>
-        <w:rPr>
-          <w:rFonts w:ascii="Arial" w:hAnsi="Arial"/>
-          <w:color w:val="000000"/>
-          <w:sz w:val="18"/>
-          <w:szCs w:val="18"/>
-          <w:lang w:eastAsia="ar-SA"/>
-        </w:rPr>
-        <w:t>,</w:t>
-      </w:r>
-      <w:r>
-        <w:rPr>
-          <w:rFonts w:ascii="Arial" w:hAnsi="Arial"/>
-          <w:color w:val="000000"/>
-          <w:sz w:val="18"/>
-          <w:szCs w:val="18"/>
-          <w:lang w:eastAsia="ar-SA"/>
-        </w:rPr>
-        <w:t xml:space="preserve"> VMWare, Cocoa, Bugzilla, JIRA</w:t>
-      </w:r>
-      <w:r>
-        <w:rPr>
-          <w:rFonts w:ascii="Arial" w:hAnsi="Arial"/>
-          <w:color w:val="000000"/>
-          <w:sz w:val="18"/>
-          <w:szCs w:val="18"/>
-          <w:lang w:eastAsia="ar-SA"/>
-        </w:rPr>
-        <w:t>,</w:t>
-      </w:r>
-      <w:r>
-        <w:rPr>
-          <w:rFonts w:ascii="Arial" w:hAnsi="Arial"/>
-          <w:color w:val="000000"/>
-          <w:sz w:val="18"/>
-          <w:szCs w:val="18"/>
-          <w:lang w:eastAsia="ar-SA"/>
-        </w:rPr>
-        <w:t xml:space="preserve"> Radar,</w:t>
-      </w:r>
-      <w:r>
-        <w:rPr>
-          <w:rFonts w:ascii="Arial" w:hAnsi="Arial"/>
-          <w:color w:val="000000"/>
-          <w:sz w:val="18"/>
-          <w:szCs w:val="18"/>
-          <w:lang w:eastAsia="ar-SA"/>
-        </w:rPr>
-        <w:t xml:space="preserve"> yocto, </w:t>
-      </w:r>
-      <w:r>
-        <w:rPr>
-          <w:rFonts w:ascii="Arial" w:hAnsi="Arial"/>
-          <w:color w:val="000000"/>
-          <w:sz w:val="18"/>
-          <w:szCs w:val="18"/>
-          <w:lang w:eastAsia="ar-SA"/>
-        </w:rPr>
-        <w:t xml:space="preserve">repo, </w:t>
-      </w:r>
-      <w:r>
-        <w:rPr>
-          <w:rFonts w:ascii="Arial" w:hAnsi="Arial"/>
-          <w:color w:val="000000"/>
-          <w:sz w:val="18"/>
-          <w:szCs w:val="18"/>
-          <w:lang w:eastAsia="ar-SA"/>
-        </w:rPr>
-        <w:t>vagrant,</w:t>
-      </w:r>
-      <w:r>
-        <w:rPr>
-          <w:rFonts w:ascii="Arial" w:hAnsi="Arial"/>
-          <w:color w:val="000000"/>
-          <w:sz w:val="18"/>
-          <w:szCs w:val="18"/>
-          <w:lang w:eastAsia="ar-SA"/>
-        </w:rPr>
-        <w:t xml:space="preserve"> Docker,</w:t>
-      </w:r>
-      <w:r>
-        <w:rPr>
-          <w:rFonts w:ascii="Arial" w:hAnsi="Arial"/>
-          <w:color w:val="000000"/>
-          <w:sz w:val="18"/>
-          <w:szCs w:val="18"/>
-          <w:lang w:eastAsia="ar-SA"/>
-        </w:rPr>
-        <w:t xml:space="preserve"> VirtualBox</w:t>
-      </w:r>
-      <w:r>
-        <w:rPr>
-          <w:rFonts w:ascii="Arial" w:hAnsi="Arial"/>
-          <w:color w:val="000000"/>
-          <w:sz w:val="18"/>
-          <w:szCs w:val="18"/>
-          <w:lang w:eastAsia="ar-SA"/>
-        </w:rPr>
-        <w:t xml:space="preserve">, </w:t>
-      </w:r>
-      <w:proofErr w:type="spellStart"/>
-      <w:r>
-        <w:rPr>
-          <w:rFonts w:ascii="Arial" w:hAnsi="Arial"/>
-          <w:color w:val="000000"/>
-          <w:sz w:val="18"/>
-          <w:szCs w:val="18"/>
-          <w:lang w:eastAsia="ar-SA"/>
-        </w:rPr>
-        <w:t>MySql</w:t>
-      </w:r>
-      <w:proofErr w:type="spellEnd"/>
-      <w:r>
-        <w:rPr>
-          <w:rFonts w:ascii="Arial" w:hAnsi="Arial"/>
-          <w:color w:val="000000"/>
-          <w:sz w:val="18"/>
-          <w:szCs w:val="18"/>
-          <w:lang w:eastAsia="ar-SA"/>
-        </w:rPr>
-        <w:t xml:space="preserve">, </w:t>
-      </w:r>
-      <w:proofErr w:type="spellStart"/>
-      <w:r>
-        <w:rPr>
-          <w:rFonts w:ascii="Arial" w:hAnsi="Arial"/>
-          <w:color w:val="000000"/>
-          <w:sz w:val="18"/>
-          <w:szCs w:val="18"/>
-          <w:lang w:eastAsia="ar-SA"/>
-        </w:rPr>
-        <w:t>PostgresQL</w:t>
-      </w:r>
-      <w:proofErr w:type="spellEnd"/>
-      <w:r>
-        <w:rPr>
-          <w:rFonts w:ascii="Arial" w:hAnsi="Arial"/>
-          <w:color w:val="000000"/>
-          <w:sz w:val="18"/>
-          <w:szCs w:val="18"/>
-          <w:lang w:eastAsia="ar-SA"/>
-        </w:rPr>
-        <w:t>, AWS</w:t>
-      </w:r>
-    </w:p>
+        <w:t xml:space="preserve"> – Personal blog, where I reflect on many life experiences, including baseball.</w:t>
+      </w:r>
+    </w:p>
+    <w:bookmarkEnd w:id="13"/>
     <w:p>
       <w:pPr>
         <w:tabs>
@@ -3854,7 +3896,7 @@
 </file>
 
 <file path=word/numbering.xml><?xml version="1.0" encoding="utf-8"?>
-<w:numbering xmlns:wpc="http://schemas.microsoft.com/office/word/2010/wordprocessingCanvas" xmlns:cx="http://schemas.microsoft.com/office/drawing/2014/chartex" xmlns:cx1="http://schemas.microsoft.com/office/drawing/2015/9/8/chartex" xmlns:cx2="http://schemas.microsoft.com/office/drawing/2015/10/21/chartex" xmlns:cx3="http://schemas.microsoft.com/office/drawing/2016/5/9/chartex" xmlns:cx4="http://schemas.microsoft.com/office/drawing/2016/5/10/chartex" xmlns:cx5="http://schemas.microsoft.com/office/drawing/2016/5/11/chartex" xmlns:cx6="http://schemas.microsoft.com/office/drawing/2016/5/12/chartex" xmlns:cx7="http://schemas.microsoft.com/office/drawing/2016/5/13/chartex" xmlns:cx8="http://schemas.microsoft.com/office/drawing/2016/5/14/chartex" xmlns:mc="http://schemas.openxmlformats.org/markup-compatibility/2006" xmlns:aink="http://schemas.microsoft.com/office/drawing/2016/ink" xmlns:am3d="http://schemas.microsoft.com/office/drawing/2017/model3d" xmlns:o="urn:schemas-microsoft-com:office:office" xmlns:oel="http://schemas.microsoft.com/office/2019/extlst" xmlns:r="http://schemas.openxmlformats.org/officeDocument/2006/relationships" xmlns:m="http://schemas.openxmlformats.org/officeDocument/2006/math" xmlns:v="urn:schemas-microsoft-com:vml" xmlns:wp14="http://schemas.microsoft.com/office/word/2010/wordprocessingDrawing" xmlns:wp="http://schemas.openxmlformats.org/drawingml/2006/wordprocessingDrawing" xmlns:w10="urn:schemas-microsoft-com:office:word" xmlns:w="http://schemas.openxmlformats.org/wordprocessingml/2006/main" xmlns:w14="http://schemas.microsoft.com/office/word/2010/wordml" xmlns:w15="http://schemas.microsoft.com/office/word/2012/wordml" xmlns:w16cex="http://schemas.microsoft.com/office/word/2018/wordml/cex" xmlns:w16cid="http://schemas.microsoft.com/office/word/2016/wordml/cid" xmlns:w16="http://schemas.microsoft.com/office/word/2018/wordml" xmlns:w16sdtdh="http://schemas.microsoft.com/office/word/2020/wordml/sdtdatahash" xmlns:w16se="http://schemas.microsoft.com/office/word/2015/wordml/symex" xmlns:wpg="http://schemas.microsoft.com/office/word/2010/wordprocessingGroup" xmlns:wpi="http://schemas.microsoft.com/office/word/2010/wordprocessingInk" xmlns:wne="http://schemas.microsoft.com/office/word/2006/wordml" xmlns:wps="http://schemas.microsoft.com/office/word/2010/wordprocessingShape" mc:Ignorable="w14 w15 w16se w16cid w16 w16cex w16sdtdh wp14">
+<w:numbering xmlns:wpc="http://schemas.microsoft.com/office/word/2010/wordprocessingCanvas" xmlns:cx="http://schemas.microsoft.com/office/drawing/2014/chartex" xmlns:cx1="http://schemas.microsoft.com/office/drawing/2015/9/8/chartex" xmlns:cx2="http://schemas.microsoft.com/office/drawing/2015/10/21/chartex" xmlns:cx3="http://schemas.microsoft.com/office/drawing/2016/5/9/chartex" xmlns:cx4="http://schemas.microsoft.com/office/drawing/2016/5/10/chartex" xmlns:cx5="http://schemas.microsoft.com/office/drawing/2016/5/11/chartex" xmlns:cx6="http://schemas.microsoft.com/office/drawing/2016/5/12/chartex" xmlns:cx7="http://schemas.microsoft.com/office/drawing/2016/5/13/chartex" xmlns:cx8="http://schemas.microsoft.com/office/drawing/2016/5/14/chartex" xmlns:mc="http://schemas.openxmlformats.org/markup-compatibility/2006" xmlns:aink="http://schemas.microsoft.com/office/drawing/2016/ink" xmlns:am3d="http://schemas.microsoft.com/office/drawing/2017/model3d" xmlns:o="urn:schemas-microsoft-com:office:office" xmlns:oel="http://schemas.microsoft.com/office/2019/extlst" xmlns:r="http://schemas.openxmlformats.org/officeDocument/2006/relationships" xmlns:m="http://schemas.openxmlformats.org/officeDocument/2006/math" xmlns:v="urn:schemas-microsoft-com:vml" xmlns:wp14="http://schemas.microsoft.com/office/word/2010/wordprocessingDrawing" xmlns:wp="http://schemas.openxmlformats.org/drawingml/2006/wordprocessingDrawing" xmlns:w10="urn:schemas-microsoft-com:office:word" xmlns:w="http://schemas.openxmlformats.org/wordprocessingml/2006/main" xmlns:w14="http://schemas.microsoft.com/office/word/2010/wordml" xmlns:w15="http://schemas.microsoft.com/office/word/2012/wordml" xmlns:w16cex="http://schemas.microsoft.com/office/word/2018/wordml/cex" xmlns:w16cid="http://schemas.microsoft.com/office/word/2016/wordml/cid" xmlns:w16="http://schemas.microsoft.com/office/word/2018/wordml" xmlns:w16du="http://schemas.microsoft.com/office/word/2023/wordml/word16du" xmlns:w16sdtdh="http://schemas.microsoft.com/office/word/2020/wordml/sdtdatahash" xmlns:w16sdtfl="http://schemas.microsoft.com/office/word/2024/wordml/sdtformatlock" xmlns:w16se="http://schemas.microsoft.com/office/word/2015/wordml/symex" xmlns:wpg="http://schemas.microsoft.com/office/word/2010/wordprocessingGroup" xmlns:wpi="http://schemas.microsoft.com/office/word/2010/wordprocessingInk" xmlns:wne="http://schemas.microsoft.com/office/word/2006/wordml" xmlns:wps="http://schemas.microsoft.com/office/word/2010/wordprocessingShape" mc:Ignorable="w14 w15 w16se w16cid w16 w16cex w16sdtdh w16sdtfl w16du wp14">
   <w:abstractNum w:abstractNumId="0" w15:restartNumberingAfterBreak="0">
     <w:nsid w:val="00000001"/>
     <w:multiLevelType w:val="singleLevel"/>
@@ -4009,7 +4051,7 @@
         <w:rFonts w:ascii="Courier New" w:hAnsi="Courier New" w:hint="default"/>
       </w:rPr>
     </w:lvl>
-    <w:lvl w:ilvl="2" w:tplc="04090005" w:tentative="1">
+    <w:lvl w:ilvl="2" w:tplc="04090005">
       <w:start w:val="1"/>
       <w:numFmt w:val="bullet"/>
       <w:lvlText w:val=""/>
@@ -4208,6 +4250,119 @@
     </w:lvl>
   </w:abstractNum>
   <w:abstractNum w:abstractNumId="8" w15:restartNumberingAfterBreak="0">
+    <w:nsid w:val="37340D37"/>
+    <w:multiLevelType w:val="hybridMultilevel"/>
+    <w:tmpl w:val="5BB0F602"/>
+    <w:lvl w:ilvl="0" w:tplc="04090001">
+      <w:start w:val="1"/>
+      <w:numFmt w:val="bullet"/>
+      <w:lvlText w:val=""/>
+      <w:lvlJc w:val="left"/>
+      <w:pPr>
+        <w:ind w:left="360" w:hanging="360"/>
+      </w:pPr>
+      <w:rPr>
+        <w:rFonts w:ascii="Symbol" w:hAnsi="Symbol" w:hint="default"/>
+      </w:rPr>
+    </w:lvl>
+    <w:lvl w:ilvl="1" w:tplc="04090003" w:tentative="1">
+      <w:start w:val="1"/>
+      <w:numFmt w:val="bullet"/>
+      <w:lvlText w:val="o"/>
+      <w:lvlJc w:val="left"/>
+      <w:pPr>
+        <w:ind w:left="1080" w:hanging="360"/>
+      </w:pPr>
+      <w:rPr>
+        <w:rFonts w:ascii="Courier New" w:hAnsi="Courier New" w:cs="Courier New" w:hint="default"/>
+      </w:rPr>
+    </w:lvl>
+    <w:lvl w:ilvl="2" w:tplc="04090005" w:tentative="1">
+      <w:start w:val="1"/>
+      <w:numFmt w:val="bullet"/>
+      <w:lvlText w:val=""/>
+      <w:lvlJc w:val="left"/>
+      <w:pPr>
+        <w:ind w:left="1800" w:hanging="360"/>
+      </w:pPr>
+      <w:rPr>
+        <w:rFonts w:ascii="Wingdings" w:hAnsi="Wingdings" w:hint="default"/>
+      </w:rPr>
+    </w:lvl>
+    <w:lvl w:ilvl="3" w:tplc="04090001" w:tentative="1">
+      <w:start w:val="1"/>
+      <w:numFmt w:val="bullet"/>
+      <w:lvlText w:val=""/>
+      <w:lvlJc w:val="left"/>
+      <w:pPr>
+        <w:ind w:left="2520" w:hanging="360"/>
+      </w:pPr>
+      <w:rPr>
+        <w:rFonts w:ascii="Symbol" w:hAnsi="Symbol" w:hint="default"/>
+      </w:rPr>
+    </w:lvl>
+    <w:lvl w:ilvl="4" w:tplc="04090003" w:tentative="1">
+      <w:start w:val="1"/>
+      <w:numFmt w:val="bullet"/>
+      <w:lvlText w:val="o"/>
+      <w:lvlJc w:val="left"/>
+      <w:pPr>
+        <w:ind w:left="3240" w:hanging="360"/>
+      </w:pPr>
+      <w:rPr>
+        <w:rFonts w:ascii="Courier New" w:hAnsi="Courier New" w:cs="Courier New" w:hint="default"/>
+      </w:rPr>
+    </w:lvl>
+    <w:lvl w:ilvl="5" w:tplc="04090005" w:tentative="1">
+      <w:start w:val="1"/>
+      <w:numFmt w:val="bullet"/>
+      <w:lvlText w:val=""/>
+      <w:lvlJc w:val="left"/>
+      <w:pPr>
+        <w:ind w:left="3960" w:hanging="360"/>
+      </w:pPr>
+      <w:rPr>
+        <w:rFonts w:ascii="Wingdings" w:hAnsi="Wingdings" w:hint="default"/>
+      </w:rPr>
+    </w:lvl>
+    <w:lvl w:ilvl="6" w:tplc="04090001" w:tentative="1">
+      <w:start w:val="1"/>
+      <w:numFmt w:val="bullet"/>
+      <w:lvlText w:val=""/>
+      <w:lvlJc w:val="left"/>
+      <w:pPr>
+        <w:ind w:left="4680" w:hanging="360"/>
+      </w:pPr>
+      <w:rPr>
+        <w:rFonts w:ascii="Symbol" w:hAnsi="Symbol" w:hint="default"/>
+      </w:rPr>
+    </w:lvl>
+    <w:lvl w:ilvl="7" w:tplc="04090003" w:tentative="1">
+      <w:start w:val="1"/>
+      <w:numFmt w:val="bullet"/>
+      <w:lvlText w:val="o"/>
+      <w:lvlJc w:val="left"/>
+      <w:pPr>
+        <w:ind w:left="5400" w:hanging="360"/>
+      </w:pPr>
+      <w:rPr>
+        <w:rFonts w:ascii="Courier New" w:hAnsi="Courier New" w:cs="Courier New" w:hint="default"/>
+      </w:rPr>
+    </w:lvl>
+    <w:lvl w:ilvl="8" w:tplc="04090005" w:tentative="1">
+      <w:start w:val="1"/>
+      <w:numFmt w:val="bullet"/>
+      <w:lvlText w:val=""/>
+      <w:lvlJc w:val="left"/>
+      <w:pPr>
+        <w:ind w:left="6120" w:hanging="360"/>
+      </w:pPr>
+      <w:rPr>
+        <w:rFonts w:ascii="Wingdings" w:hAnsi="Wingdings" w:hint="default"/>
+      </w:rPr>
+    </w:lvl>
+  </w:abstractNum>
+  <w:abstractNum w:abstractNumId="9" w15:restartNumberingAfterBreak="0">
     <w:nsid w:val="419C4A17"/>
     <w:multiLevelType w:val="hybridMultilevel"/>
     <w:tmpl w:val="89F4C61A"/>
@@ -4320,7 +4475,7 @@
       </w:rPr>
     </w:lvl>
   </w:abstractNum>
-  <w:abstractNum w:abstractNumId="9" w15:restartNumberingAfterBreak="0">
+  <w:abstractNum w:abstractNumId="10" w15:restartNumberingAfterBreak="0">
     <w:nsid w:val="47583E97"/>
     <w:multiLevelType w:val="hybridMultilevel"/>
     <w:tmpl w:val="CBF2935E"/>
@@ -4433,7 +4588,7 @@
       </w:rPr>
     </w:lvl>
   </w:abstractNum>
-  <w:abstractNum w:abstractNumId="10" w15:restartNumberingAfterBreak="0">
+  <w:abstractNum w:abstractNumId="11" w15:restartNumberingAfterBreak="0">
     <w:nsid w:val="482155EA"/>
     <w:multiLevelType w:val="hybridMultilevel"/>
     <w:tmpl w:val="95789E5C"/>
@@ -4565,25 +4720,28 @@
     <w:abstractNumId w:val="4"/>
   </w:num>
   <w:num w:numId="7" w16cid:durableId="933782079">
-    <w:abstractNumId w:val="9"/>
+    <w:abstractNumId w:val="10"/>
   </w:num>
   <w:num w:numId="8" w16cid:durableId="671031766">
     <w:abstractNumId w:val="7"/>
   </w:num>
   <w:num w:numId="9" w16cid:durableId="832988854">
-    <w:abstractNumId w:val="10"/>
+    <w:abstractNumId w:val="11"/>
   </w:num>
   <w:num w:numId="10" w16cid:durableId="1207916414">
     <w:abstractNumId w:val="6"/>
   </w:num>
   <w:num w:numId="11" w16cid:durableId="1077828715">
+    <w:abstractNumId w:val="9"/>
+  </w:num>
+  <w:num w:numId="12" w16cid:durableId="938220208">
     <w:abstractNumId w:val="8"/>
   </w:num>
 </w:numbering>
 </file>
 
 <file path=word/styles.xml><?xml version="1.0" encoding="utf-8"?>
-<w:styles xmlns:mc="http://schemas.openxmlformats.org/markup-compatibility/2006" xmlns:r="http://schemas.openxmlformats.org/officeDocument/2006/relationships" xmlns:w="http://schemas.openxmlformats.org/wordprocessingml/2006/main" xmlns:w14="http://schemas.microsoft.com/office/word/2010/wordml" xmlns:w15="http://schemas.microsoft.com/office/word/2012/wordml" xmlns:w16cex="http://schemas.microsoft.com/office/word/2018/wordml/cex" xmlns:w16cid="http://schemas.microsoft.com/office/word/2016/wordml/cid" xmlns:w16="http://schemas.microsoft.com/office/word/2018/wordml" xmlns:w16sdtdh="http://schemas.microsoft.com/office/word/2020/wordml/sdtdatahash" xmlns:w16se="http://schemas.microsoft.com/office/word/2015/wordml/symex" mc:Ignorable="w14 w15 w16se w16cid w16 w16cex w16sdtdh">
+<w:styles xmlns:mc="http://schemas.openxmlformats.org/markup-compatibility/2006" xmlns:r="http://schemas.openxmlformats.org/officeDocument/2006/relationships" xmlns:w="http://schemas.openxmlformats.org/wordprocessingml/2006/main" xmlns:w14="http://schemas.microsoft.com/office/word/2010/wordml" xmlns:w15="http://schemas.microsoft.com/office/word/2012/wordml" xmlns:w16cex="http://schemas.microsoft.com/office/word/2018/wordml/cex" xmlns:w16cid="http://schemas.microsoft.com/office/word/2016/wordml/cid" xmlns:w16="http://schemas.microsoft.com/office/word/2018/wordml" xmlns:w16du="http://schemas.microsoft.com/office/word/2023/wordml/word16du" xmlns:w16sdtdh="http://schemas.microsoft.com/office/word/2020/wordml/sdtdatahash" xmlns:w16sdtfl="http://schemas.microsoft.com/office/word/2024/wordml/sdtformatlock" xmlns:w16se="http://schemas.microsoft.com/office/word/2015/wordml/symex" mc:Ignorable="w14 w15 w16se w16cid w16 w16cex w16sdtdh w16sdtfl w16du">
   <w:docDefaults>
     <w:rPrDefault>
       <w:rPr>

</xml_diff>